<commit_message>
Refactor design documents for Server Reboot Report: streamline content and enhance clarity
</commit_message>
<xml_diff>
--- a/Ansible to Orchestrator Transition/InProgress/psscript/Servers Reboot Report by CN/Documentation/02_Design_Document.docx
+++ b/Ansible to Orchestrator Transition/InProgress/psscript/Servers Reboot Report by CN/Documentation/02_Design_Document.docx
@@ -1,23 +1,23 @@
 
 <file path=word/document.xml><?xml version="1.0" encoding="utf-8"?>
-<w:document xmlns:w="http://schemas.openxmlformats.org/wordprocessingml/2006/main" xmlns:m="http://schemas.openxmlformats.org/officeDocument/2006/math" xmlns:r="http://schemas.openxmlformats.org/officeDocument/2006/relationships" xmlns:o="urn:schemas-microsoft-com:office:office" xmlns:v="urn:schemas-microsoft-com:vml" xmlns:w10="urn:schemas-microsoft-com:office:word" xmlns:a="http://schemas.openxmlformats.org/drawingml/2006/main" xmlns:pic="http://schemas.openxmlformats.org/drawingml/2006/picture" xmlns:wp="http://schemas.openxmlformats.org/drawingml/2006/wordprocessingDrawing">
+<w:document xmlns:wpc="http://schemas.microsoft.com/office/word/2010/wordprocessingCanvas" xmlns:cx="http://schemas.microsoft.com/office/drawing/2014/chartex" xmlns:cx1="http://schemas.microsoft.com/office/drawing/2015/9/8/chartex" xmlns:cx2="http://schemas.microsoft.com/office/drawing/2015/10/21/chartex" xmlns:cx3="http://schemas.microsoft.com/office/drawing/2016/5/9/chartex" xmlns:cx4="http://schemas.microsoft.com/office/drawing/2016/5/10/chartex" xmlns:cx5="http://schemas.microsoft.com/office/drawing/2016/5/11/chartex" xmlns:cx6="http://schemas.microsoft.com/office/drawing/2016/5/12/chartex" xmlns:cx7="http://schemas.microsoft.com/office/drawing/2016/5/13/chartex" xmlns:cx8="http://schemas.microsoft.com/office/drawing/2016/5/14/chartex" xmlns:mc="http://schemas.openxmlformats.org/markup-compatibility/2006" xmlns:aink="http://schemas.microsoft.com/office/drawing/2016/ink" xmlns:am3d="http://schemas.microsoft.com/office/drawing/2017/model3d" xmlns:o="urn:schemas-microsoft-com:office:office" xmlns:oel="http://schemas.microsoft.com/office/2019/extlst" xmlns:r="http://schemas.openxmlformats.org/officeDocument/2006/relationships" xmlns:m="http://schemas.openxmlformats.org/officeDocument/2006/math" xmlns:v="urn:schemas-microsoft-com:vml" xmlns:wp14="http://schemas.microsoft.com/office/word/2010/wordprocessingDrawing" xmlns:wp="http://schemas.openxmlformats.org/drawingml/2006/wordprocessingDrawing" xmlns:w10="urn:schemas-microsoft-com:office:word" xmlns:w="http://schemas.openxmlformats.org/wordprocessingml/2006/main" xmlns:w14="http://schemas.microsoft.com/office/word/2010/wordml" xmlns:w15="http://schemas.microsoft.com/office/word/2012/wordml" xmlns:w16cex="http://schemas.microsoft.com/office/word/2018/wordml/cex" xmlns:w16cid="http://schemas.microsoft.com/office/word/2016/wordml/cid" xmlns:w16="http://schemas.microsoft.com/office/word/2018/wordml" xmlns:w16du="http://schemas.microsoft.com/office/word/2023/wordml/word16du" xmlns:w16sdtdh="http://schemas.microsoft.com/office/word/2020/wordml/sdtdatahash" xmlns:w16sdtfl="http://schemas.microsoft.com/office/word/2024/wordml/sdtformatlock" xmlns:w16se="http://schemas.microsoft.com/office/word/2015/wordml/symex" xmlns:wpg="http://schemas.microsoft.com/office/word/2010/wordprocessingGroup" xmlns:wpi="http://schemas.microsoft.com/office/word/2010/wordprocessingInk" xmlns:wne="http://schemas.microsoft.com/office/word/2006/wordml" xmlns:wps="http://schemas.microsoft.com/office/word/2010/wordprocessingShape" mc:Ignorable="w14 w15 w16se w16cid w16 w16cex w16sdtdh w16sdtfl w16du wp14">
   <w:body>
-    <w:bookmarkStart w:id="19" w:name="X562f42d8ee1f9bc92d9a6c017a25f138ad84caa"/>
     <w:p>
       <w:pPr>
         <w:pStyle w:val="Heading1"/>
       </w:pPr>
-      <w:r>
-        <w:t xml:space="preserve">Design Document — Server Reboot Report (vRO)</w:t>
-      </w:r>
-    </w:p>
-    <w:bookmarkStart w:id="9" w:name="X7a8237e7d315e89f38a741ffdb86653a37c1ad7"/>
+      <w:bookmarkStart w:id="0" w:name="X562f42d8ee1f9bc92d9a6c017a25f138ad84caa"/>
+      <w:r>
+        <w:t>Design Document — Server Reboot Report (vRO)</w:t>
+      </w:r>
+    </w:p>
     <w:p>
       <w:pPr>
         <w:pStyle w:val="Heading2"/>
       </w:pPr>
-      <w:r>
-        <w:t xml:space="preserve">1. Architecture overview</w:t>
+      <w:bookmarkStart w:id="1" w:name="X7a8237e7d315e89f38a741ffdb86653a37c1ad7"/>
+      <w:r>
+        <w:t>1. Architecture overview</w:t>
       </w:r>
     </w:p>
     <w:p>
@@ -25,41 +25,26 @@
         <w:pStyle w:val="FirstParagraph"/>
       </w:pPr>
       <w:r>
-        <w:t xml:space="preserve">A single vRO workflow (</w:t>
+        <w:t>A single vRO workflow (</w:t>
       </w:r>
       <w:r>
         <w:rPr>
           <w:b/>
           <w:bCs/>
         </w:rPr>
-        <w:t xml:space="preserve">Get Server Reboot Report</w:t>
-      </w:r>
-      <w:r>
-        <w:t xml:space="preserve">)</w:t>
-      </w:r>
-      <w:r>
-        <w:t xml:space="preserve"> </w:t>
-      </w:r>
-      <w:r>
-        <w:t xml:space="preserve">orchestrates one synchronous PowerShell invocation on a PowerShell host. All logic —</w:t>
-      </w:r>
-      <w:r>
-        <w:t xml:space="preserve"> </w:t>
-      </w:r>
-      <w:r>
-        <w:t xml:space="preserve">AD resolution, the pending-reboot check, counting, HTML report and mail — lives in</w:t>
-      </w:r>
-      <w:r>
-        <w:t xml:space="preserve"> </w:t>
-      </w:r>
-      <w:r>
-        <w:rPr>
-          <w:rStyle w:val="VerbatimChar"/>
-        </w:rPr>
-        <w:t xml:space="preserve">cvs_functions.ps1</w:t>
-      </w:r>
-      <w:r>
-        <w:t xml:space="preserve">. vRO builds the invocation, runs it, and classifies the transcript.</w:t>
+        <w:t>Get Server Reboot Report</w:t>
+      </w:r>
+      <w:r>
+        <w:t xml:space="preserve">) orchestrates one synchronous PowerShell invocation on a PowerShell host. All logic — AD resolution, the pending-reboot check, counting, HTML report and mail — lives in </w:t>
+      </w:r>
+      <w:r>
+        <w:rPr>
+          <w:rStyle w:val="VerbatimChar"/>
+        </w:rPr>
+        <w:t>cvs_functions.ps1</w:t>
+      </w:r>
+      <w:r>
+        <w:t>. vRO builds the invocation, runs it, and classifies the transcript.</w:t>
       </w:r>
     </w:p>
     <w:p>
@@ -67,383 +52,353 @@
         <w:pStyle w:val="BodyText"/>
       </w:pPr>
       <w:r>
-        <w:t xml:space="preserve">The workflow is</w:t>
-      </w:r>
-      <w:r>
-        <w:t xml:space="preserve"> </w:t>
+        <w:t xml:space="preserve">The workflow is </w:t>
       </w:r>
       <w:r>
         <w:rPr>
           <w:b/>
           <w:bCs/>
         </w:rPr>
-        <w:t xml:space="preserve">read-only</w:t>
-      </w:r>
-      <w:r>
-        <w:t xml:space="preserve">: it invokes</w:t>
-      </w:r>
-      <w:r>
-        <w:t xml:space="preserve"> </w:t>
-      </w:r>
-      <w:r>
-        <w:rPr>
-          <w:rStyle w:val="VerbatimChar"/>
-        </w:rPr>
-        <w:t xml:space="preserve">Get-ServerRebootReportStatus-ByCN</w:t>
-      </w:r>
-      <w:r>
-        <w:t xml:space="preserve"> </w:t>
-      </w:r>
-      <w:r>
-        <w:t xml:space="preserve">and never</w:t>
-      </w:r>
-      <w:r>
-        <w:t xml:space="preserve"> </w:t>
-      </w:r>
-      <w:r>
-        <w:t xml:space="preserve">issues a reboot. There is no</w:t>
-      </w:r>
-      <w:r>
-        <w:t xml:space="preserve"> </w:t>
-      </w:r>
-      <w:r>
-        <w:rPr>
-          <w:rStyle w:val="VerbatimChar"/>
-        </w:rPr>
-        <w:t xml:space="preserve">rebootMode</w:t>
-      </w:r>
-      <w:r>
-        <w:t xml:space="preserve"> </w:t>
-      </w:r>
-      <w:r>
-        <w:t xml:space="preserve">safety gate because there is nothing to gate.</w:t>
-      </w:r>
-    </w:p>
-    <w:bookmarkEnd w:id="9"/>
-    <w:bookmarkStart w:id="10" w:name="X8ebf4272557d59cc9e0a94e798e506dc17cc399"/>
+        <w:t>read-only</w:t>
+      </w:r>
+      <w:r>
+        <w:t xml:space="preserve">: it invokes </w:t>
+      </w:r>
+      <w:r>
+        <w:rPr>
+          <w:rStyle w:val="VerbatimChar"/>
+        </w:rPr>
+        <w:t>Get-ServerRebootReportStatus-ByCN</w:t>
+      </w:r>
+      <w:r>
+        <w:t xml:space="preserve"> and never issues a reboot. There is no </w:t>
+      </w:r>
+      <w:r>
+        <w:rPr>
+          <w:rStyle w:val="VerbatimChar"/>
+        </w:rPr>
+        <w:t>rebootMode</w:t>
+      </w:r>
+      <w:r>
+        <w:t xml:space="preserve"> safety gate because there is nothing to gate.</w:t>
+      </w:r>
+    </w:p>
     <w:p>
       <w:pPr>
         <w:pStyle w:val="Heading2"/>
       </w:pPr>
-      <w:r>
-        <w:t xml:space="preserve">2. Components</w:t>
+      <w:bookmarkStart w:id="2" w:name="X8ebf4272557d59cc9e0a94e798e506dc17cc399"/>
+      <w:bookmarkEnd w:id="1"/>
+      <w:r>
+        <w:t>2. Components</w:t>
       </w:r>
     </w:p>
     <w:tbl>
       <w:tblPr>
         <w:tblStyle w:val="Table"/>
-        <w:tblW w:type="auto" w:w="0"/>
-        <w:tblLook w:firstRow="1" w:lastRow="0" w:firstColumn="0" w:lastColumn="0" w:noHBand="0" w:noVBand="0" w:val="0020"/>
+        <w:tblW w:w="0" w:type="auto"/>
+        <w:tblLayout w:type="fixed"/>
+        <w:tblLook w:val="0020" w:firstRow="1" w:lastRow="0" w:firstColumn="0" w:lastColumn="0" w:noHBand="0" w:noVBand="0"/>
       </w:tblPr>
       <w:tblGrid>
-        <w:gridCol w:w="3960"/>
-        <w:gridCol w:w="3960"/>
+        <w:gridCol w:w="4338"/>
+        <w:gridCol w:w="5238"/>
       </w:tblGrid>
       <w:tr>
         <w:trPr>
-          <w:tblHeader w:val="on"/>
+          <w:cnfStyle w:val="100000000000" w:firstRow="1" w:lastRow="0" w:firstColumn="0" w:lastColumn="0" w:oddVBand="0" w:evenVBand="0" w:oddHBand="0" w:evenHBand="0" w:firstRowFirstColumn="0" w:firstRowLastColumn="0" w:lastRowFirstColumn="0" w:lastRowLastColumn="0"/>
+          <w:tblHeader/>
         </w:trPr>
         <w:tc>
-          <w:tcPr/>
+          <w:tcPr>
+            <w:tcW w:w="4338" w:type="dxa"/>
+          </w:tcPr>
           <w:p>
             <w:pPr>
               <w:pStyle w:val="Compact"/>
             </w:pPr>
             <w:r>
-              <w:t xml:space="preserve">Component</w:t>
+              <w:t>Component</w:t>
             </w:r>
           </w:p>
         </w:tc>
         <w:tc>
-          <w:tcPr/>
+          <w:tcPr>
+            <w:tcW w:w="5238" w:type="dxa"/>
+          </w:tcPr>
           <w:p>
             <w:pPr>
               <w:pStyle w:val="Compact"/>
             </w:pPr>
             <w:r>
-              <w:t xml:space="preserve">Role</w:t>
+              <w:t>Role</w:t>
             </w:r>
           </w:p>
         </w:tc>
       </w:tr>
       <w:tr>
         <w:tc>
-          <w:tcPr/>
+          <w:tcPr>
+            <w:tcW w:w="4338" w:type="dxa"/>
+          </w:tcPr>
           <w:p>
             <w:pPr>
               <w:pStyle w:val="Compact"/>
             </w:pPr>
             <w:r>
-              <w:t xml:space="preserve">Workflow</w:t>
-            </w:r>
-            <w:r>
-              <w:t xml:space="preserve"> </w:t>
+              <w:t xml:space="preserve">Workflow </w:t>
             </w:r>
             <w:r>
               <w:rPr>
                 <w:b/>
                 <w:bCs/>
               </w:rPr>
-              <w:t xml:space="preserve">Get Server Reboot Report</w:t>
+              <w:t>Get Server Reboot Report</w:t>
             </w:r>
           </w:p>
         </w:tc>
         <w:tc>
-          <w:tcPr/>
+          <w:tcPr>
+            <w:tcW w:w="5238" w:type="dxa"/>
+          </w:tcPr>
           <w:p>
             <w:pPr>
               <w:pStyle w:val="Compact"/>
             </w:pPr>
             <w:r>
-              <w:t xml:space="preserve">Orchestration + end-state classification</w:t>
+              <w:t>Orchestration + end-state classification</w:t>
             </w:r>
           </w:p>
         </w:tc>
       </w:tr>
       <w:tr>
         <w:tc>
-          <w:tcPr/>
+          <w:tcPr>
+            <w:tcW w:w="4338" w:type="dxa"/>
+          </w:tcPr>
           <w:p>
             <w:pPr>
               <w:pStyle w:val="Compact"/>
             </w:pPr>
             <w:r>
-              <w:t xml:space="preserve">Action</w:t>
-            </w:r>
-            <w:r>
-              <w:t xml:space="preserve"> </w:t>
+              <w:t xml:space="preserve">Action </w:t>
             </w:r>
             <w:r>
               <w:rPr>
                 <w:b/>
                 <w:bCs/>
               </w:rPr>
-              <w:t xml:space="preserve">buildServerRebootReportInvocation</w:t>
-            </w:r>
-            <w:r>
-              <w:t xml:space="preserve"> </w:t>
-            </w:r>
-            <w:r>
-              <w:t xml:space="preserve">(</w:t>
+              <w:t>buildServerRebootReportInvocation</w:t>
+            </w:r>
+            <w:r>
+              <w:t xml:space="preserve"> (</w:t>
             </w:r>
             <w:r>
               <w:rPr>
                 <w:rStyle w:val="VerbatimChar"/>
               </w:rPr>
-              <w:t xml:space="preserve">com.broadcom.pso.vcf.vm.guestOps.windows.reboot</w:t>
-            </w:r>
-            <w:r>
-              <w:t xml:space="preserve">)</w:t>
+              <w:t>com.broadcom.pso.vcf.vm.guestOps.windows.reboot</w:t>
+            </w:r>
+            <w:r>
+              <w:t>)</w:t>
             </w:r>
           </w:p>
         </w:tc>
         <w:tc>
-          <w:tcPr/>
+          <w:tcPr>
+            <w:tcW w:w="5238" w:type="dxa"/>
+          </w:tcPr>
           <w:p>
             <w:pPr>
               <w:pStyle w:val="Compact"/>
             </w:pPr>
             <w:r>
-              <w:t xml:space="preserve">Builds the validated PowerShell invocation string</w:t>
+              <w:t>Builds the validated PowerShell invocation string</w:t>
             </w:r>
           </w:p>
         </w:tc>
       </w:tr>
       <w:tr>
         <w:tc>
-          <w:tcPr/>
+          <w:tcPr>
+            <w:tcW w:w="4338" w:type="dxa"/>
+          </w:tcPr>
           <w:p>
             <w:pPr>
               <w:pStyle w:val="Compact"/>
             </w:pPr>
             <w:r>
-              <w:t xml:space="preserve">OOTB</w:t>
-            </w:r>
-            <w:r>
-              <w:t xml:space="preserve"> </w:t>
+              <w:t xml:space="preserve">OOTB </w:t>
             </w:r>
             <w:r>
               <w:rPr>
                 <w:b/>
                 <w:bCs/>
               </w:rPr>
-              <w:t xml:space="preserve">Invoke a PowerShell script</w:t>
+              <w:t>Invoke a PowerShell script</w:t>
             </w:r>
           </w:p>
         </w:tc>
         <w:tc>
-          <w:tcPr/>
+          <w:tcPr>
+            <w:tcW w:w="5238" w:type="dxa"/>
+          </w:tcPr>
           <w:p>
             <w:pPr>
               <w:pStyle w:val="Compact"/>
             </w:pPr>
             <w:r>
-              <w:t xml:space="preserve">Runs the string on the PS host (linked sub-workflow)</w:t>
+              <w:t>Runs the string on the PS host (linked sub-workflow)</w:t>
             </w:r>
           </w:p>
         </w:tc>
       </w:tr>
       <w:tr>
         <w:tc>
-          <w:tcPr/>
+          <w:tcPr>
+            <w:tcW w:w="4338" w:type="dxa"/>
+          </w:tcPr>
           <w:p>
             <w:pPr>
               <w:pStyle w:val="Compact"/>
             </w:pPr>
             <w:r>
-              <w:t xml:space="preserve">Action</w:t>
-            </w:r>
-            <w:r>
-              <w:t xml:space="preserve"> </w:t>
+              <w:t xml:space="preserve">Action </w:t>
             </w:r>
             <w:r>
               <w:rPr>
                 <w:b/>
                 <w:bCs/>
               </w:rPr>
-              <w:t xml:space="preserve">parseScriptOutput</w:t>
-            </w:r>
-            <w:r>
-              <w:t xml:space="preserve"> </w:t>
-            </w:r>
-            <w:r>
-              <w:t xml:space="preserve">(</w:t>
+              <w:t>parseScriptOutput</w:t>
+            </w:r>
+            <w:r>
+              <w:t xml:space="preserve"> (</w:t>
             </w:r>
             <w:r>
               <w:rPr>
                 <w:rStyle w:val="VerbatimChar"/>
               </w:rPr>
-              <w:t xml:space="preserve">com.broadcom.pso.vcf.vm.guestOps.files.windows.logs</w:t>
-            </w:r>
-            <w:r>
-              <w:t xml:space="preserve">)</w:t>
+              <w:t>com.broadcom.pso.vcf.vm.guestOps.files.windows.logs</w:t>
+            </w:r>
+            <w:r>
+              <w:t>)</w:t>
             </w:r>
           </w:p>
         </w:tc>
         <w:tc>
-          <w:tcPr/>
+          <w:tcPr>
+            <w:tcW w:w="5238" w:type="dxa"/>
+          </w:tcPr>
           <w:p>
             <w:pPr>
               <w:pStyle w:val="Compact"/>
             </w:pPr>
             <w:r>
-              <w:t xml:space="preserve">Parses transcript →</w:t>
-            </w:r>
-            <w:r>
-              <w:t xml:space="preserve"> </w:t>
+              <w:t xml:space="preserve">Parses transcript → </w:t>
             </w:r>
             <w:r>
               <w:rPr>
                 <w:rStyle w:val="VerbatimChar"/>
               </w:rPr>
-              <w:t xml:space="preserve">success</w:t>
-            </w:r>
-            <w:r>
-              <w:t xml:space="preserve"> </w:t>
-            </w:r>
-            <w:r>
-              <w:t xml:space="preserve">/</w:t>
-            </w:r>
-            <w:r>
-              <w:t xml:space="preserve"> </w:t>
+              <w:t>success</w:t>
+            </w:r>
+            <w:r>
+              <w:t xml:space="preserve"> / </w:t>
             </w:r>
             <w:r>
               <w:rPr>
                 <w:rStyle w:val="VerbatimChar"/>
               </w:rPr>
-              <w:t xml:space="preserve">outputText</w:t>
-            </w:r>
-            <w:r>
-              <w:t xml:space="preserve"> </w:t>
-            </w:r>
-            <w:r>
-              <w:t xml:space="preserve">/</w:t>
-            </w:r>
-            <w:r>
-              <w:t xml:space="preserve"> </w:t>
+              <w:t>outputText</w:t>
+            </w:r>
+            <w:r>
+              <w:t xml:space="preserve"> / </w:t>
             </w:r>
             <w:r>
               <w:rPr>
                 <w:rStyle w:val="VerbatimChar"/>
               </w:rPr>
-              <w:t xml:space="preserve">errorText</w:t>
+              <w:t>errorText</w:t>
             </w:r>
           </w:p>
         </w:tc>
       </w:tr>
       <w:tr>
         <w:tc>
-          <w:tcPr/>
+          <w:tcPr>
+            <w:tcW w:w="4338" w:type="dxa"/>
+          </w:tcPr>
           <w:p>
             <w:pPr>
               <w:pStyle w:val="Compact"/>
             </w:pPr>
             <w:r>
-              <w:t xml:space="preserve">Script</w:t>
-            </w:r>
-            <w:r>
-              <w:t xml:space="preserve"> </w:t>
+              <w:t xml:space="preserve">Script </w:t>
             </w:r>
             <w:r>
               <w:rPr>
                 <w:b/>
                 <w:bCs/>
               </w:rPr>
-              <w:t xml:space="preserve">cvs_functions.ps1</w:t>
-            </w:r>
-            <w:r>
-              <w:t xml:space="preserve"> </w:t>
-            </w:r>
-            <w:r>
-              <w:t xml:space="preserve">on the PS host</w:t>
+              <w:t>cvs_functions.ps1</w:t>
+            </w:r>
+            <w:r>
+              <w:t xml:space="preserve"> on the PS host</w:t>
             </w:r>
           </w:p>
         </w:tc>
         <w:tc>
-          <w:tcPr/>
+          <w:tcPr>
+            <w:tcW w:w="5238" w:type="dxa"/>
+          </w:tcPr>
           <w:p>
             <w:pPr>
               <w:pStyle w:val="Compact"/>
             </w:pPr>
             <w:r>
-              <w:t xml:space="preserve">Does the actual work (resolver, WMI checks, report, mail)</w:t>
+              <w:t>Does the actual work (resolver, WMI checks, report, mail)</w:t>
             </w:r>
           </w:p>
         </w:tc>
       </w:tr>
       <w:tr>
         <w:tc>
-          <w:tcPr/>
+          <w:tcPr>
+            <w:tcW w:w="4338" w:type="dxa"/>
+          </w:tcPr>
           <w:p>
             <w:pPr>
               <w:pStyle w:val="Compact"/>
             </w:pPr>
             <w:r>
-              <w:t xml:space="preserve">PowerShell host</w:t>
+              <w:t>PowerShell host</w:t>
             </w:r>
           </w:p>
         </w:tc>
         <w:tc>
-          <w:tcPr/>
+          <w:tcPr>
+            <w:tcW w:w="5238" w:type="dxa"/>
+          </w:tcPr>
           <w:p>
             <w:pPr>
               <w:pStyle w:val="Compact"/>
             </w:pPr>
             <w:r>
-              <w:t xml:space="preserve">Runs the script; reaches targets over RPC/WMI</w:t>
+              <w:t>Runs the script; reaches targets over RPC/WMI</w:t>
             </w:r>
           </w:p>
         </w:tc>
       </w:tr>
     </w:tbl>
-    <w:bookmarkEnd w:id="10"/>
-    <w:bookmarkStart w:id="11" w:name="X58f1c639cfdbeee20cb6eaaddd84bbbcad350c8"/>
     <w:p>
       <w:pPr>
         <w:pStyle w:val="Heading2"/>
       </w:pPr>
-      <w:r>
-        <w:t xml:space="preserve">3. Data flow (as built)</w:t>
+      <w:bookmarkStart w:id="3" w:name="X58f1c639cfdbeee20cb6eaaddd84bbbcad350c8"/>
+      <w:bookmarkEnd w:id="2"/>
+      <w:r>
+        <w:t>3. Data flow (as built)</w:t>
       </w:r>
     </w:p>
     <w:p>
@@ -454,7 +409,7 @@
         <w:rPr>
           <w:rStyle w:val="VerbatimChar"/>
         </w:rPr>
-        <w:t xml:space="preserve">Set Log Marker (workflow.id)                          [root]</w:t>
+        <w:t>Set Log Marker (workflow.id)                          [root]</w:t>
       </w:r>
       <w:r>
         <w:br/>
@@ -534,7 +489,7 @@
         <w:pStyle w:val="FirstParagraph"/>
       </w:pPr>
       <w:r>
-        <w:t xml:space="preserve">The action emits this invocation (values illustrative):</w:t>
+        <w:t>The action emits this invocation (values illustrative):</w:t>
       </w:r>
     </w:p>
     <w:p>
@@ -545,7 +500,7 @@
         <w:rPr>
           <w:rStyle w:val="VerbatimChar"/>
         </w:rPr>
-        <w:t xml:space="preserve">&amp; "C:\PSO\Scripts\cvs_functions.ps1" -Action 'Get-ServerRebootReportStatus-ByCN' `</w:t>
+        <w:t>&amp; "C:\PSO\Scripts\cvs_functions.ps1" -Action 'Get-ServerRebootReportStatus-ByCN' `</w:t>
       </w:r>
       <w:r>
         <w:br/>
@@ -554,6 +509,7 @@
         <w:rPr>
           <w:rStyle w:val="VerbatimChar"/>
         </w:rPr>
+        <w:lastRenderedPageBreak/>
         <w:t xml:space="preserve">  -SecurityGroup_CN '&lt;groupDN&gt;' -DomainName '&lt;domain&gt;' -eMailReport 'yes' `</w:t>
       </w:r>
       <w:r>
@@ -592,65 +548,38 @@
         <w:rPr>
           <w:rStyle w:val="VerbatimChar"/>
         </w:rPr>
-        <w:t xml:space="preserve">*&gt;&amp;1 | Out-String -Width 4096</w:t>
-      </w:r>
-      <w:r>
-        <w:t xml:space="preserve"> </w:t>
-      </w:r>
-      <w:r>
-        <w:t xml:space="preserve">merges all PowerShell streams into the success stream</w:t>
-      </w:r>
-      <w:r>
-        <w:t xml:space="preserve"> </w:t>
-      </w:r>
-      <w:r>
-        <w:t xml:space="preserve">so the vRO plug-in returns the transcript to</w:t>
-      </w:r>
-      <w:r>
-        <w:t xml:space="preserve"> </w:t>
-      </w:r>
-      <w:r>
-        <w:rPr>
-          <w:rStyle w:val="VerbatimChar"/>
-        </w:rPr>
-        <w:t xml:space="preserve">parseScriptOutput</w:t>
-      </w:r>
-      <w:r>
-        <w:t xml:space="preserve"> </w:t>
-      </w:r>
-      <w:r>
-        <w:t xml:space="preserve">(which only sees the</w:t>
-      </w:r>
-      <w:r>
-        <w:t xml:space="preserve"> </w:t>
-      </w:r>
-      <w:r>
-        <w:t xml:space="preserve">success stream) without wrapping long</w:t>
-      </w:r>
-      <w:r>
-        <w:t xml:space="preserve"> </w:t>
-      </w:r>
-      <w:r>
-        <w:rPr>
-          <w:rStyle w:val="VerbatimChar"/>
-        </w:rPr>
-        <w:t xml:space="preserve">Error:</w:t>
-      </w:r>
-      <w:r>
-        <w:t xml:space="preserve"> </w:t>
-      </w:r>
-      <w:r>
-        <w:t xml:space="preserve">lines.</w:t>
-      </w:r>
-    </w:p>
-    <w:bookmarkEnd w:id="11"/>
-    <w:bookmarkStart w:id="12" w:name="Xa93ca0b351c7c0c0ef8073a288b865a918621e9"/>
+        <w:t>*&gt;&amp;1 | Out-String -Width 4096</w:t>
+      </w:r>
+      <w:r>
+        <w:t xml:space="preserve"> merges all PowerShell streams into the success stream so the vRO plug-in returns the transcript to </w:t>
+      </w:r>
+      <w:r>
+        <w:rPr>
+          <w:rStyle w:val="VerbatimChar"/>
+        </w:rPr>
+        <w:t>parseScriptOutput</w:t>
+      </w:r>
+      <w:r>
+        <w:t xml:space="preserve"> (which only sees the success stream) without wrapping long </w:t>
+      </w:r>
+      <w:r>
+        <w:rPr>
+          <w:rStyle w:val="VerbatimChar"/>
+        </w:rPr>
+        <w:t>Error:</w:t>
+      </w:r>
+      <w:r>
+        <w:t xml:space="preserve"> lines.</w:t>
+      </w:r>
+    </w:p>
     <w:p>
       <w:pPr>
         <w:pStyle w:val="Heading2"/>
       </w:pPr>
-      <w:r>
-        <w:t xml:space="preserve">4. Resolver design (why ByCN + recursive)</w:t>
+      <w:bookmarkStart w:id="4" w:name="Xa93ca0b351c7c0c0ef8073a288b865a918621e9"/>
+      <w:bookmarkEnd w:id="3"/>
+      <w:r>
+        <w:t>4. Resolver design (why ByCN + recursive)</w:t>
       </w:r>
     </w:p>
     <w:p>
@@ -661,25 +590,19 @@
         <w:rPr>
           <w:rStyle w:val="VerbatimChar"/>
         </w:rPr>
-        <w:t xml:space="preserve">Get-ServerRebootReportStatus-ByCN</w:t>
-      </w:r>
-      <w:r>
-        <w:t xml:space="preserve"> </w:t>
-      </w:r>
-      <w:r>
-        <w:t xml:space="preserve">uses</w:t>
-      </w:r>
-      <w:r>
-        <w:t xml:space="preserve"> </w:t>
-      </w:r>
-      <w:r>
-        <w:rPr>
-          <w:rStyle w:val="VerbatimChar"/>
-        </w:rPr>
-        <w:t xml:space="preserve">Get-ListOfServers-ByCN</w:t>
-      </w:r>
-      <w:r>
-        <w:t xml:space="preserve">:</w:t>
+        <w:t>Get-ServerRebootReportStatus-ByCN</w:t>
+      </w:r>
+      <w:r>
+        <w:t xml:space="preserve"> uses </w:t>
+      </w:r>
+      <w:r>
+        <w:rPr>
+          <w:rStyle w:val="VerbatimChar"/>
+        </w:rPr>
+        <w:t>Get-ListOfServers-ByCN</w:t>
+      </w:r>
+      <w:r>
+        <w:t>:</w:t>
       </w:r>
     </w:p>
     <w:p>
@@ -687,7 +610,7 @@
         <w:pStyle w:val="Compact"/>
         <w:numPr>
           <w:ilvl w:val="0"/>
-          <w:numId w:val="1001"/>
+          <w:numId w:val="2"/>
         </w:numPr>
       </w:pPr>
       <w:r>
@@ -695,13 +618,10 @@
           <w:b/>
           <w:bCs/>
         </w:rPr>
-        <w:t xml:space="preserve">Recursive</w:t>
-      </w:r>
-      <w:r>
-        <w:t xml:space="preserve"> </w:t>
-      </w:r>
-      <w:r>
-        <w:t xml:space="preserve">— nested AD sub-groups are expanded to their computer members.</w:t>
+        <w:t>Recursive</w:t>
+      </w:r>
+      <w:r>
+        <w:t xml:space="preserve"> — nested AD sub-groups are expanded to their computer members.</w:t>
       </w:r>
     </w:p>
     <w:p>
@@ -709,7 +629,7 @@
         <w:pStyle w:val="Compact"/>
         <w:numPr>
           <w:ilvl w:val="0"/>
-          <w:numId w:val="1001"/>
+          <w:numId w:val="2"/>
         </w:numPr>
       </w:pPr>
       <w:r>
@@ -717,13 +637,10 @@
           <w:b/>
           <w:bCs/>
         </w:rPr>
-        <w:t xml:space="preserve">Computer-class filtered</w:t>
-      </w:r>
-      <w:r>
-        <w:t xml:space="preserve"> </w:t>
-      </w:r>
-      <w:r>
-        <w:t xml:space="preserve">— user / group objects are excluded.</w:t>
+        <w:t>Computer-class filtered</w:t>
+      </w:r>
+      <w:r>
+        <w:t xml:space="preserve"> — user / group objects are excluded.</w:t>
       </w:r>
     </w:p>
     <w:p>
@@ -731,7 +648,7 @@
         <w:pStyle w:val="Compact"/>
         <w:numPr>
           <w:ilvl w:val="0"/>
-          <w:numId w:val="1001"/>
+          <w:numId w:val="2"/>
         </w:numPr>
       </w:pPr>
       <w:r>
@@ -739,13 +656,10 @@
           <w:b/>
           <w:bCs/>
         </w:rPr>
-        <w:t xml:space="preserve">Enabled filtered</w:t>
-      </w:r>
-      <w:r>
-        <w:t xml:space="preserve"> </w:t>
-      </w:r>
-      <w:r>
-        <w:t xml:space="preserve">— disabled computer accounts are skipped and logged.</w:t>
+        <w:t>Enabled filtered</w:t>
+      </w:r>
+      <w:r>
+        <w:t xml:space="preserve"> — disabled computer accounts are skipped and logged.</w:t>
       </w:r>
     </w:p>
     <w:p>
@@ -753,7 +667,7 @@
         <w:pStyle w:val="Compact"/>
         <w:numPr>
           <w:ilvl w:val="0"/>
-          <w:numId w:val="1001"/>
+          <w:numId w:val="2"/>
         </w:numPr>
       </w:pPr>
       <w:r>
@@ -761,19 +675,10 @@
           <w:b/>
           <w:bCs/>
         </w:rPr>
-        <w:t xml:space="preserve">Per-object isolation</w:t>
-      </w:r>
-      <w:r>
-        <w:t xml:space="preserve"> </w:t>
-      </w:r>
-      <w:r>
-        <w:t xml:space="preserve">— one unresolvable member is skipped, not fatal; a</w:t>
-      </w:r>
-      <w:r>
-        <w:t xml:space="preserve"> </w:t>
-      </w:r>
-      <w:r>
-        <w:t xml:space="preserve">group-level failure (group missing / domain unreachable) terminates the run.</w:t>
+        <w:t>Per-object isolation</w:t>
+      </w:r>
+      <w:r>
+        <w:t xml:space="preserve"> — one unresolvable member is skipped, not fatal; a group-level failure (group missing / domain unreachable) terminates the run.</w:t>
       </w:r>
     </w:p>
     <w:p>
@@ -781,77 +686,47 @@
         <w:pStyle w:val="FirstParagraph"/>
       </w:pPr>
       <w:r>
-        <w:t xml:space="preserve">Recursion is correct</w:t>
-      </w:r>
-      <w:r>
-        <w:t xml:space="preserve"> </w:t>
+        <w:t xml:space="preserve">Recursion is correct </w:t>
       </w:r>
       <w:r>
         <w:rPr>
           <w:b/>
           <w:bCs/>
         </w:rPr>
-        <w:t xml:space="preserve">because the run is read-only</w:t>
-      </w:r>
-      <w:r>
-        <w:t xml:space="preserve">: expanding a nested group only</w:t>
-      </w:r>
-      <w:r>
-        <w:t xml:space="preserve"> </w:t>
-      </w:r>
-      <w:r>
-        <w:t xml:space="preserve">yields a more complete picture of what needs rebooting — never an unintended action.</w:t>
-      </w:r>
-      <w:r>
-        <w:t xml:space="preserve"> </w:t>
-      </w:r>
-      <w:r>
-        <w:t xml:space="preserve">This is the deliberate opposite of</w:t>
-      </w:r>
-      <w:r>
-        <w:t xml:space="preserve"> </w:t>
+        <w:t>because the run is read-only</w:t>
+      </w:r>
+      <w:r>
+        <w:t xml:space="preserve">: expanding a nested group only yields a more complete picture of what needs rebooting — never an unintended action. This is the deliberate opposite of </w:t>
       </w:r>
       <w:r>
         <w:rPr>
           <w:b/>
           <w:bCs/>
         </w:rPr>
-        <w:t xml:space="preserve">Invoke-ServerReboot</w:t>
-      </w:r>
-      <w:r>
-        <w:t xml:space="preserve">, which uses a</w:t>
-      </w:r>
-      <w:r>
-        <w:t xml:space="preserve"> </w:t>
+        <w:t>Invoke-ServerReboot</w:t>
+      </w:r>
+      <w:r>
+        <w:t xml:space="preserve">, which uses a </w:t>
       </w:r>
       <w:r>
         <w:rPr>
           <w:b/>
           <w:bCs/>
         </w:rPr>
-        <w:t xml:space="preserve">non-recursive</w:t>
-      </w:r>
-      <w:r>
-        <w:t xml:space="preserve"> </w:t>
-      </w:r>
-      <w:r>
-        <w:t xml:space="preserve">resolver (Server Reboots change S-7) because rebooting is</w:t>
-      </w:r>
-      <w:r>
-        <w:t xml:space="preserve"> </w:t>
-      </w:r>
-      <w:r>
-        <w:t xml:space="preserve">destructive and targets must be explicit.</w:t>
-      </w:r>
-    </w:p>
-    <w:bookmarkEnd w:id="12"/>
-    <w:bookmarkStart w:id="13" w:name="X5680e53f25bfe23758d6f909918f0a5005434e9"/>
+        <w:t>non-recursive</w:t>
+      </w:r>
+      <w:r>
+        <w:t xml:space="preserve"> resolver (Server Reboots change S-7) because rebooting is destructive and targets must be explicit.</w:t>
+      </w:r>
+    </w:p>
     <w:p>
       <w:pPr>
         <w:pStyle w:val="Heading2"/>
       </w:pPr>
-      <w:r>
-        <w:t xml:space="preserve">5. Input / recipient handling</w:t>
+      <w:bookmarkStart w:id="5" w:name="X5680e53f25bfe23758d6f909918f0a5005434e9"/>
+      <w:bookmarkEnd w:id="4"/>
+      <w:r>
+        <w:t>5. Input / recipient handling</w:t>
       </w:r>
     </w:p>
     <w:p>
@@ -859,57 +734,36 @@
         <w:pStyle w:val="Compact"/>
         <w:numPr>
           <w:ilvl w:val="0"/>
-          <w:numId w:val="1002"/>
+          <w:numId w:val="3"/>
         </w:numPr>
       </w:pPr>
       <w:r>
         <w:rPr>
           <w:rStyle w:val="VerbatimChar"/>
         </w:rPr>
-        <w:t xml:space="preserve">mailTo</w:t>
-      </w:r>
-      <w:r>
-        <w:t xml:space="preserve"> </w:t>
-      </w:r>
-      <w:r>
-        <w:t xml:space="preserve">/</w:t>
-      </w:r>
-      <w:r>
-        <w:t xml:space="preserve"> </w:t>
-      </w:r>
-      <w:r>
-        <w:rPr>
-          <w:rStyle w:val="VerbatimChar"/>
-        </w:rPr>
-        <w:t xml:space="preserve">mailCc</w:t>
-      </w:r>
-      <w:r>
-        <w:t xml:space="preserve"> </w:t>
-      </w:r>
-      <w:r>
-        <w:t xml:space="preserve">are</w:t>
-      </w:r>
-      <w:r>
-        <w:t xml:space="preserve"> </w:t>
+        <w:t>mailTo</w:t>
+      </w:r>
+      <w:r>
+        <w:t xml:space="preserve"> / </w:t>
+      </w:r>
+      <w:r>
+        <w:rPr>
+          <w:rStyle w:val="VerbatimChar"/>
+        </w:rPr>
+        <w:t>mailCc</w:t>
+      </w:r>
+      <w:r>
+        <w:t xml:space="preserve"> are </w:t>
       </w:r>
       <w:r>
         <w:rPr>
           <w:b/>
           <w:bCs/>
         </w:rPr>
-        <w:t xml:space="preserve">Array/string</w:t>
-      </w:r>
-      <w:r>
-        <w:t xml:space="preserve"> </w:t>
-      </w:r>
-      <w:r>
-        <w:t xml:space="preserve">(one address per element). The action</w:t>
-      </w:r>
-      <w:r>
-        <w:t xml:space="preserve"> </w:t>
-      </w:r>
-      <w:r>
-        <w:t xml:space="preserve">normalizes either an array or a CSV string to a clean comma-separated list.</w:t>
+        <w:t>Array/string</w:t>
+      </w:r>
+      <w:r>
+        <w:t xml:space="preserve"> (one address per element). The action normalizes either an array or a CSV string to a clean comma-separated list.</w:t>
       </w:r>
     </w:p>
     <w:p>
@@ -917,7 +771,7 @@
         <w:pStyle w:val="Compact"/>
         <w:numPr>
           <w:ilvl w:val="0"/>
-          <w:numId w:val="1002"/>
+          <w:numId w:val="3"/>
         </w:numPr>
       </w:pPr>
       <w:r>
@@ -925,52 +779,28 @@
           <w:b/>
           <w:bCs/>
         </w:rPr>
-        <w:t xml:space="preserve">Char-split guard:</w:t>
-      </w:r>
-      <w:r>
-        <w:t xml:space="preserve"> </w:t>
-      </w:r>
-      <w:r>
-        <w:t xml:space="preserve">if a scalar string is mis-bound to an Array input, vRO splits</w:t>
-      </w:r>
-      <w:r>
-        <w:t xml:space="preserve"> </w:t>
-      </w:r>
-      <w:r>
-        <w:t xml:space="preserve">it into characters; the action detects a recipient token with no</w:t>
-      </w:r>
-      <w:r>
-        <w:t xml:space="preserve"> </w:t>
-      </w:r>
-      <w:r>
-        <w:rPr>
-          <w:rStyle w:val="VerbatimChar"/>
-        </w:rPr>
-        <w:t xml:space="preserve">@</w:t>
-      </w:r>
-      <w:r>
-        <w:t xml:space="preserve"> </w:t>
-      </w:r>
-      <w:r>
-        <w:t xml:space="preserve">and throws a</w:t>
-      </w:r>
-      <w:r>
-        <w:t xml:space="preserve"> </w:t>
-      </w:r>
-      <w:r>
-        <w:t xml:space="preserve">clear error rather than emailing</w:t>
-      </w:r>
-      <w:r>
-        <w:t xml:space="preserve"> </w:t>
-      </w:r>
-      <w:r>
-        <w:rPr>
-          <w:rStyle w:val="VerbatimChar"/>
-        </w:rPr>
-        <w:t xml:space="preserve">j,f,o,...</w:t>
-      </w:r>
-      <w:r>
-        <w:t xml:space="preserve">.</w:t>
+        <w:t>Char-split guard:</w:t>
+      </w:r>
+      <w:r>
+        <w:t xml:space="preserve"> if a scalar string is mis-bound to an Array input, vRO splits it into characters; the action detects a recipient token with no </w:t>
+      </w:r>
+      <w:r>
+        <w:rPr>
+          <w:rStyle w:val="VerbatimChar"/>
+        </w:rPr>
+        <w:t>@</w:t>
+      </w:r>
+      <w:r>
+        <w:t xml:space="preserve"> and throws a clear error rather than emailing </w:t>
+      </w:r>
+      <w:r>
+        <w:rPr>
+          <w:rStyle w:val="VerbatimChar"/>
+        </w:rPr>
+        <w:t>j,f,o,...</w:t>
+      </w:r>
+      <w:r>
+        <w:t>.</w:t>
       </w:r>
     </w:p>
     <w:p>
@@ -978,63 +808,35 @@
         <w:pStyle w:val="Compact"/>
         <w:numPr>
           <w:ilvl w:val="0"/>
-          <w:numId w:val="1002"/>
+          <w:numId w:val="3"/>
         </w:numPr>
       </w:pPr>
       <w:r>
         <w:rPr>
           <w:rStyle w:val="VerbatimChar"/>
         </w:rPr>
-        <w:t xml:space="preserve">-HeaderNotesSubstr</w:t>
-      </w:r>
-      <w:r>
-        <w:t xml:space="preserve"> </w:t>
-      </w:r>
-      <w:r>
-        <w:t xml:space="preserve">(report header label) is</w:t>
-      </w:r>
-      <w:r>
-        <w:t xml:space="preserve"> </w:t>
+        <w:t>-HeaderNotesSubstr</w:t>
+      </w:r>
+      <w:r>
+        <w:t xml:space="preserve"> (report header label) is </w:t>
       </w:r>
       <w:r>
         <w:rPr>
           <w:b/>
           <w:bCs/>
         </w:rPr>
-        <w:t xml:space="preserve">derived from</w:t>
-      </w:r>
-      <w:r>
-        <w:rPr>
+        <w:t xml:space="preserve">derived from </w:t>
+      </w:r>
+      <w:r>
+        <w:rPr>
+          <w:rStyle w:val="VerbatimChar"/>
           <w:b/>
           <w:bCs/>
         </w:rPr>
-        <w:t xml:space="preserve"> </w:t>
-      </w:r>
-      <w:r>
-        <w:rPr>
-          <w:rStyle w:val="VerbatimChar"/>
-          <w:b/>
-          <w:bCs/>
-        </w:rPr>
-        <w:t xml:space="preserve">groupDN</w:t>
-      </w:r>
-      <w:r>
-        <w:t xml:space="preserve"> </w:t>
-      </w:r>
-      <w:r>
-        <w:t xml:space="preserve">inside the</w:t>
-      </w:r>
-      <w:r>
-        <w:t xml:space="preserve"> </w:t>
-      </w:r>
-      <w:r>
-        <w:t xml:space="preserve">action, not a separate input — the header can never name a different group than the</w:t>
-      </w:r>
-      <w:r>
-        <w:t xml:space="preserve"> </w:t>
-      </w:r>
-      <w:r>
-        <w:t xml:space="preserve">one targeted.</w:t>
+        <w:t>groupDN</w:t>
+      </w:r>
+      <w:r>
+        <w:t xml:space="preserve"> inside the action, not a separate input — the header can never name a different group than the one targeted.</w:t>
       </w:r>
     </w:p>
     <w:p>
@@ -1042,36 +844,30 @@
         <w:pStyle w:val="Compact"/>
         <w:numPr>
           <w:ilvl w:val="0"/>
-          <w:numId w:val="1002"/>
+          <w:numId w:val="3"/>
         </w:numPr>
       </w:pPr>
       <w:r>
-        <w:t xml:space="preserve">The FROM address is derived by the script (</w:t>
-      </w:r>
-      <w:r>
-        <w:rPr>
-          <w:rStyle w:val="VerbatimChar"/>
-        </w:rPr>
-        <w:t xml:space="preserve">&lt;PSHOST&gt;_Do_Not_Reply@&lt;domain&gt;</w:t>
-      </w:r>
-      <w:r>
-        <w:t xml:space="preserve">); there</w:t>
-      </w:r>
-      <w:r>
-        <w:t xml:space="preserve"> </w:t>
-      </w:r>
-      <w:r>
-        <w:t xml:space="preserve">is no from-address input.</w:t>
-      </w:r>
-    </w:p>
-    <w:bookmarkEnd w:id="13"/>
-    <w:bookmarkStart w:id="14" w:name="X92ef77442e40beb3e61b084e7720369af4dd55c"/>
+        <w:t>The FROM address is derived by the script (</w:t>
+      </w:r>
+      <w:r>
+        <w:rPr>
+          <w:rStyle w:val="VerbatimChar"/>
+        </w:rPr>
+        <w:t>&lt;PSHOST&gt;_Do_Not_Reply@&lt;domain&gt;</w:t>
+      </w:r>
+      <w:r>
+        <w:t>); there is no from-address input.</w:t>
+      </w:r>
+    </w:p>
     <w:p>
       <w:pPr>
         <w:pStyle w:val="Heading2"/>
       </w:pPr>
-      <w:r>
-        <w:t xml:space="preserve">6. Dependencies</w:t>
+      <w:bookmarkStart w:id="6" w:name="X92ef77442e40beb3e61b084e7720369af4dd55c"/>
+      <w:bookmarkEnd w:id="5"/>
+      <w:r>
+        <w:t>6. Dependencies</w:t>
       </w:r>
     </w:p>
     <w:p>
@@ -1079,7 +875,7 @@
         <w:pStyle w:val="Compact"/>
         <w:numPr>
           <w:ilvl w:val="0"/>
-          <w:numId w:val="1003"/>
+          <w:numId w:val="4"/>
         </w:numPr>
       </w:pPr>
       <w:r>
@@ -1087,28 +883,19 @@
           <w:b/>
           <w:bCs/>
         </w:rPr>
-        <w:t xml:space="preserve">parseScriptOutput</w:t>
-      </w:r>
-      <w:r>
-        <w:t xml:space="preserve"> </w:t>
-      </w:r>
-      <w:r>
-        <w:t xml:space="preserve">is reused from the Event Log package module</w:t>
-      </w:r>
-      <w:r>
-        <w:t xml:space="preserve"> </w:t>
-      </w:r>
-      <w:r>
-        <w:rPr>
-          <w:rStyle w:val="VerbatimChar"/>
-        </w:rPr>
-        <w:t xml:space="preserve">com.broadcom.pso.vcf.vm.guestOps.files.windows.logs</w:t>
-      </w:r>
-      <w:r>
-        <w:t xml:space="preserve"> </w:t>
-      </w:r>
-      <w:r>
-        <w:t xml:space="preserve">— that package must be installed.</w:t>
+        <w:t>parseScriptOutput</w:t>
+      </w:r>
+      <w:r>
+        <w:t xml:space="preserve"> is reused from the Event Log package module </w:t>
+      </w:r>
+      <w:r>
+        <w:rPr>
+          <w:rStyle w:val="VerbatimChar"/>
+        </w:rPr>
+        <w:t>com.broadcom.pso.vcf.vm.guestOps.files.windows.logs</w:t>
+      </w:r>
+      <w:r>
+        <w:t xml:space="preserve"> — that package must be installed.</w:t>
       </w:r>
     </w:p>
     <w:p>
@@ -1116,7 +903,7 @@
         <w:pStyle w:val="Compact"/>
         <w:numPr>
           <w:ilvl w:val="0"/>
-          <w:numId w:val="1003"/>
+          <w:numId w:val="4"/>
         </w:numPr>
       </w:pPr>
       <w:r>
@@ -1124,34 +911,19 @@
           <w:b/>
           <w:bCs/>
         </w:rPr>
-        <w:t xml:space="preserve">cvs_functions.ps1</w:t>
-      </w:r>
-      <w:r>
-        <w:t xml:space="preserve"> </w:t>
-      </w:r>
-      <w:r>
-        <w:t xml:space="preserve">must be deployed on the PS host and must contain the</w:t>
-      </w:r>
-      <w:r>
-        <w:t xml:space="preserve"> </w:t>
-      </w:r>
-      <w:r>
-        <w:t xml:space="preserve">optional-CC</w:t>
-      </w:r>
-      <w:r>
-        <w:t xml:space="preserve"> </w:t>
-      </w:r>
-      <w:r>
-        <w:rPr>
-          <w:rStyle w:val="VerbatimChar"/>
-        </w:rPr>
-        <w:t xml:space="preserve">SendMail</w:t>
-      </w:r>
-      <w:r>
-        <w:t xml:space="preserve"> </w:t>
-      </w:r>
-      <w:r>
-        <w:t xml:space="preserve">fix (Change-Register R-2) or emailed reports fail.</w:t>
+        <w:t>cvs_functions.ps1</w:t>
+      </w:r>
+      <w:r>
+        <w:t xml:space="preserve"> must be deployed on the PS host and must contain the optional-CC </w:t>
+      </w:r>
+      <w:r>
+        <w:rPr>
+          <w:rStyle w:val="VerbatimChar"/>
+        </w:rPr>
+        <w:t>SendMail</w:t>
+      </w:r>
+      <w:r>
+        <w:t xml:space="preserve"> fix (Change-Register R-2) or emailed reports fail.</w:t>
       </w:r>
     </w:p>
     <w:p>
@@ -1159,7 +931,7 @@
         <w:pStyle w:val="Compact"/>
         <w:numPr>
           <w:ilvl w:val="0"/>
-          <w:numId w:val="1003"/>
+          <w:numId w:val="4"/>
         </w:numPr>
       </w:pPr>
       <w:r>
@@ -1167,23 +939,21 @@
           <w:b/>
           <w:bCs/>
         </w:rPr>
-        <w:t xml:space="preserve">ActiveDirectory</w:t>
-      </w:r>
-      <w:r>
-        <w:t xml:space="preserve"> </w:t>
-      </w:r>
-      <w:r>
-        <w:t xml:space="preserve">PowerShell module on the PS host (group resolution).</w:t>
-      </w:r>
-    </w:p>
-    <w:bookmarkEnd w:id="14"/>
-    <w:bookmarkStart w:id="15" w:name="Xf81142dceab1a88741eff856edb17107a6c5c1c"/>
+        <w:t>ActiveDirectory</w:t>
+      </w:r>
+      <w:r>
+        <w:t xml:space="preserve"> PowerShell module on the PS host (group resolution).</w:t>
+      </w:r>
+    </w:p>
     <w:p>
       <w:pPr>
         <w:pStyle w:val="Heading2"/>
       </w:pPr>
-      <w:r>
-        <w:t xml:space="preserve">7. Assumptions</w:t>
+      <w:bookmarkStart w:id="7" w:name="Xf81142dceab1a88741eff856edb17107a6c5c1c"/>
+      <w:bookmarkEnd w:id="6"/>
+      <w:r>
+        <w:lastRenderedPageBreak/>
+        <w:t>7. Assumptions</w:t>
       </w:r>
     </w:p>
     <w:p>
@@ -1191,26 +961,20 @@
         <w:pStyle w:val="Compact"/>
         <w:numPr>
           <w:ilvl w:val="0"/>
-          <w:numId w:val="1004"/>
+          <w:numId w:val="5"/>
         </w:numPr>
       </w:pPr>
       <w:r>
-        <w:t xml:space="preserve">The PowerShell host is registered in vRO and bound to the workflow</w:t>
-      </w:r>
-      <w:r>
-        <w:t xml:space="preserve"> </w:t>
-      </w:r>
-      <w:r>
-        <w:rPr>
-          <w:rStyle w:val="VerbatimChar"/>
-        </w:rPr>
-        <w:t xml:space="preserve">host</w:t>
-      </w:r>
-      <w:r>
-        <w:t xml:space="preserve"> </w:t>
-      </w:r>
-      <w:r>
-        <w:t xml:space="preserve">attribute.</w:t>
+        <w:t xml:space="preserve">The PowerShell host is registered in vRO and bound to the workflow </w:t>
+      </w:r>
+      <w:r>
+        <w:rPr>
+          <w:rStyle w:val="VerbatimChar"/>
+        </w:rPr>
+        <w:t>host</w:t>
+      </w:r>
+      <w:r>
+        <w:t xml:space="preserve"> attribute.</w:t>
       </w:r>
     </w:p>
     <w:p>
@@ -1218,11 +982,11 @@
         <w:pStyle w:val="Compact"/>
         <w:numPr>
           <w:ilvl w:val="0"/>
-          <w:numId w:val="1004"/>
+          <w:numId w:val="5"/>
         </w:numPr>
       </w:pPr>
       <w:r>
-        <w:t xml:space="preserve">The account running the script can query targets over RPC/WMI and resolve the group.</w:t>
+        <w:t>The account running the script can query targets over RPC/WMI and resolve the group.</w:t>
       </w:r>
     </w:p>
     <w:p>
@@ -1230,189 +994,204 @@
         <w:pStyle w:val="Compact"/>
         <w:numPr>
           <w:ilvl w:val="0"/>
-          <w:numId w:val="1004"/>
+          <w:numId w:val="5"/>
         </w:numPr>
       </w:pPr>
       <w:r>
-        <w:t xml:space="preserve">SMTP relay accepts mail from the PS host.</w:t>
-      </w:r>
-    </w:p>
-    <w:bookmarkEnd w:id="15"/>
-    <w:bookmarkStart w:id="16" w:name="X3edc1a7d1bf239d7e82d644197be85b8d4bd278"/>
+        <w:t>SMTP relay accepts mail from the PS host.</w:t>
+      </w:r>
+    </w:p>
     <w:p>
       <w:pPr>
         <w:pStyle w:val="Heading2"/>
       </w:pPr>
-      <w:r>
-        <w:t xml:space="preserve">8. Risks and mitigations</w:t>
+      <w:bookmarkStart w:id="8" w:name="X3edc1a7d1bf239d7e82d644197be85b8d4bd278"/>
+      <w:bookmarkEnd w:id="7"/>
+      <w:r>
+        <w:t>8. Risks and mitigations</w:t>
       </w:r>
     </w:p>
     <w:tbl>
       <w:tblPr>
         <w:tblStyle w:val="Table"/>
-        <w:tblW w:type="auto" w:w="0"/>
-        <w:tblLook w:firstRow="1" w:lastRow="0" w:firstColumn="0" w:lastColumn="0" w:noHBand="0" w:noVBand="0" w:val="0020"/>
+        <w:tblW w:w="0" w:type="auto"/>
+        <w:tblLook w:val="0020" w:firstRow="1" w:lastRow="0" w:firstColumn="0" w:lastColumn="0" w:noHBand="0" w:noVBand="0"/>
       </w:tblPr>
       <w:tblGrid>
-        <w:gridCol w:w="3960"/>
-        <w:gridCol w:w="3960"/>
+        <w:gridCol w:w="4239"/>
+        <w:gridCol w:w="5337"/>
       </w:tblGrid>
       <w:tr>
         <w:trPr>
-          <w:tblHeader w:val="on"/>
+          <w:cnfStyle w:val="100000000000" w:firstRow="1" w:lastRow="0" w:firstColumn="0" w:lastColumn="0" w:oddVBand="0" w:evenVBand="0" w:oddHBand="0" w:evenHBand="0" w:firstRowFirstColumn="0" w:firstRowLastColumn="0" w:lastRowFirstColumn="0" w:lastRowLastColumn="0"/>
+          <w:tblHeader/>
         </w:trPr>
         <w:tc>
-          <w:tcPr/>
+          <w:tcPr>
+            <w:tcW w:w="0" w:type="auto"/>
+          </w:tcPr>
           <w:p>
             <w:pPr>
               <w:pStyle w:val="Compact"/>
             </w:pPr>
             <w:r>
-              <w:t xml:space="preserve">Risk</w:t>
+              <w:t>Risk</w:t>
             </w:r>
           </w:p>
         </w:tc>
         <w:tc>
-          <w:tcPr/>
+          <w:tcPr>
+            <w:tcW w:w="0" w:type="auto"/>
+          </w:tcPr>
           <w:p>
             <w:pPr>
               <w:pStyle w:val="Compact"/>
             </w:pPr>
             <w:r>
-              <w:t xml:space="preserve">Mitigation</w:t>
+              <w:t>Mitigation</w:t>
             </w:r>
           </w:p>
         </w:tc>
       </w:tr>
       <w:tr>
         <w:tc>
-          <w:tcPr/>
+          <w:tcPr>
+            <w:tcW w:w="0" w:type="auto"/>
+          </w:tcPr>
           <w:p>
             <w:pPr>
               <w:pStyle w:val="Compact"/>
             </w:pPr>
             <w:r>
-              <w:t xml:space="preserve">Production report set changes (recursive vs legacy)</w:t>
+              <w:t>Production report set changes (recursive vs legacy)</w:t>
             </w:r>
           </w:p>
         </w:tc>
         <w:tc>
-          <w:tcPr/>
+          <w:tcPr>
+            <w:tcW w:w="0" w:type="auto"/>
+          </w:tcPr>
           <w:p>
             <w:pPr>
               <w:pStyle w:val="Compact"/>
             </w:pPr>
             <w:r>
-              <w:t xml:space="preserve">Documented in R-1; validate group membership before cutover</w:t>
+              <w:t>Documented in R-1; validate group membership before cutover</w:t>
             </w:r>
           </w:p>
         </w:tc>
       </w:tr>
       <w:tr>
         <w:tc>
-          <w:tcPr/>
+          <w:tcPr>
+            <w:tcW w:w="0" w:type="auto"/>
+          </w:tcPr>
           <w:p>
             <w:pPr>
               <w:pStyle w:val="Compact"/>
             </w:pPr>
             <w:r>
-              <w:t xml:space="preserve">Stale host script breaks emailed report (CC bug)</w:t>
+              <w:t>Stale host script breaks emailed report (CC bug)</w:t>
             </w:r>
           </w:p>
         </w:tc>
         <w:tc>
-          <w:tcPr/>
+          <w:tcPr>
+            <w:tcW w:w="0" w:type="auto"/>
+          </w:tcPr>
           <w:p>
             <w:pPr>
               <w:pStyle w:val="Compact"/>
             </w:pPr>
             <w:r>
-              <w:t xml:space="preserve">Implementation Guide verifies the fix is present</w:t>
+              <w:t>Implementation Guide verifies the fix is present</w:t>
             </w:r>
           </w:p>
         </w:tc>
       </w:tr>
       <w:tr>
         <w:tc>
-          <w:tcPr/>
+          <w:tcPr>
+            <w:tcW w:w="0" w:type="auto"/>
+          </w:tcPr>
           <w:p>
             <w:pPr>
               <w:pStyle w:val="Compact"/>
             </w:pPr>
             <w:r>
-              <w:t xml:space="preserve">Scalar string bound to</w:t>
-            </w:r>
-            <w:r>
-              <w:t xml:space="preserve"> </w:t>
+              <w:t xml:space="preserve">Scalar string bound to </w:t>
             </w:r>
             <w:r>
               <w:rPr>
                 <w:rStyle w:val="VerbatimChar"/>
               </w:rPr>
-              <w:t xml:space="preserve">mailTo</w:t>
-            </w:r>
-            <w:r>
-              <w:t xml:space="preserve">/</w:t>
+              <w:t>mailTo</w:t>
+            </w:r>
+            <w:r>
+              <w:t>/</w:t>
             </w:r>
             <w:r>
               <w:rPr>
                 <w:rStyle w:val="VerbatimChar"/>
               </w:rPr>
-              <w:t xml:space="preserve">mailCc</w:t>
-            </w:r>
-            <w:r>
-              <w:t xml:space="preserve"> </w:t>
-            </w:r>
-            <w:r>
-              <w:t xml:space="preserve">→ char-split</w:t>
+              <w:t>mailCc</w:t>
+            </w:r>
+            <w:r>
+              <w:t xml:space="preserve"> → char-split</w:t>
             </w:r>
           </w:p>
         </w:tc>
         <w:tc>
-          <w:tcPr/>
+          <w:tcPr>
+            <w:tcW w:w="0" w:type="auto"/>
+          </w:tcPr>
           <w:p>
             <w:pPr>
               <w:pStyle w:val="Compact"/>
             </w:pPr>
             <w:r>
-              <w:t xml:space="preserve">Action throws a clear error; bind as Array elements</w:t>
+              <w:t>Action throws a clear error; bind as Array elements</w:t>
             </w:r>
           </w:p>
         </w:tc>
       </w:tr>
       <w:tr>
         <w:tc>
-          <w:tcPr/>
+          <w:tcPr>
+            <w:tcW w:w="0" w:type="auto"/>
+          </w:tcPr>
           <w:p>
             <w:pPr>
               <w:pStyle w:val="Compact"/>
             </w:pPr>
             <w:r>
-              <w:t xml:space="preserve">Long run on a large / slow group</w:t>
+              <w:t>Long run on a large / slow group</w:t>
             </w:r>
           </w:p>
         </w:tc>
         <w:tc>
-          <w:tcPr/>
+          <w:tcPr>
+            <w:tcW w:w="0" w:type="auto"/>
+          </w:tcPr>
           <w:p>
             <w:pPr>
               <w:pStyle w:val="Compact"/>
             </w:pPr>
             <w:r>
-              <w:t xml:space="preserve">Ensure PS host WinRM operation timeout exceeds total query time</w:t>
+              <w:t>Ensure PS host WinRM operation timeout exceeds total query time</w:t>
             </w:r>
           </w:p>
         </w:tc>
       </w:tr>
     </w:tbl>
-    <w:bookmarkEnd w:id="16"/>
-    <w:bookmarkStart w:id="17" w:name="Xceb666e44c796cd82f1d67eae8ae76338044d64"/>
     <w:p>
       <w:pPr>
         <w:pStyle w:val="Heading2"/>
       </w:pPr>
-      <w:r>
-        <w:t xml:space="preserve">9. Security considerations</w:t>
+      <w:bookmarkStart w:id="9" w:name="Xceb666e44c796cd82f1d67eae8ae76338044d64"/>
+      <w:bookmarkEnd w:id="8"/>
+      <w:r>
+        <w:t>9. Security considerations</w:t>
       </w:r>
     </w:p>
     <w:p>
@@ -1420,11 +1199,11 @@
         <w:pStyle w:val="Compact"/>
         <w:numPr>
           <w:ilvl w:val="0"/>
-          <w:numId w:val="1005"/>
+          <w:numId w:val="6"/>
         </w:numPr>
       </w:pPr>
       <w:r>
-        <w:t xml:space="preserve">Read-only: no state change on targets.</w:t>
+        <w:t>Read-only: no state change on targets.</w:t>
       </w:r>
     </w:p>
     <w:p>
@@ -1432,17 +1211,11 @@
         <w:pStyle w:val="Compact"/>
         <w:numPr>
           <w:ilvl w:val="0"/>
-          <w:numId w:val="1005"/>
+          <w:numId w:val="6"/>
         </w:numPr>
       </w:pPr>
       <w:r>
-        <w:t xml:space="preserve">Runs under the PS host credential; scope that account to least privilege needed for</w:t>
-      </w:r>
-      <w:r>
-        <w:t xml:space="preserve"> </w:t>
-      </w:r>
-      <w:r>
-        <w:t xml:space="preserve">remote WMI/registry reads and AD group resolution.</w:t>
+        <w:t>Runs under the PS host credential; scope that account to least privilege needed for remote WMI/registry reads and AD group resolution.</w:t>
       </w:r>
     </w:p>
     <w:p>
@@ -1450,27 +1223,21 @@
         <w:pStyle w:val="Compact"/>
         <w:numPr>
           <w:ilvl w:val="0"/>
-          <w:numId w:val="1005"/>
+          <w:numId w:val="6"/>
         </w:numPr>
       </w:pPr>
       <w:r>
-        <w:t xml:space="preserve">Report may list server names and logged-on sessions — treat the email distribution</w:t>
-      </w:r>
-      <w:r>
-        <w:t xml:space="preserve"> </w:t>
-      </w:r>
-      <w:r>
-        <w:t xml:space="preserve">list as sensitive.</w:t>
-      </w:r>
-    </w:p>
-    <w:bookmarkEnd w:id="17"/>
-    <w:bookmarkStart w:id="18" w:name="X9618b39b058d37225b56ccfe699b85101457625"/>
+        <w:t>Report may list server names and logged-on sessions — treat the email distribution list as sensitive.</w:t>
+      </w:r>
+    </w:p>
     <w:p>
       <w:pPr>
         <w:pStyle w:val="Heading2"/>
       </w:pPr>
-      <w:r>
-        <w:t xml:space="preserve">10. Operational considerations</w:t>
+      <w:bookmarkStart w:id="10" w:name="X9618b39b058d37225b56ccfe699b85101457625"/>
+      <w:bookmarkEnd w:id="9"/>
+      <w:r>
+        <w:t>10. Operational considerations</w:t>
       </w:r>
     </w:p>
     <w:p>
@@ -1478,17 +1245,11 @@
         <w:pStyle w:val="Compact"/>
         <w:numPr>
           <w:ilvl w:val="0"/>
-          <w:numId w:val="1006"/>
+          <w:numId w:val="7"/>
         </w:numPr>
       </w:pPr>
       <w:r>
-        <w:t xml:space="preserve">Runtime scales roughly linearly with group size and with unreachable servers (each</w:t>
-      </w:r>
-      <w:r>
-        <w:t xml:space="preserve"> </w:t>
-      </w:r>
-      <w:r>
-        <w:t xml:space="preserve">waits out its RPC/WMI timeout).</w:t>
+        <w:t>Runtime scales roughly linearly with group size and with unreachable servers (each waits out its RPC/WMI timeout).</w:t>
       </w:r>
     </w:p>
     <w:p>
@@ -1496,26 +1257,20 @@
         <w:pStyle w:val="Compact"/>
         <w:numPr>
           <w:ilvl w:val="0"/>
-          <w:numId w:val="1006"/>
+          <w:numId w:val="7"/>
         </w:numPr>
       </w:pPr>
       <w:r>
-        <w:t xml:space="preserve">Every log line carries</w:t>
-      </w:r>
-      <w:r>
-        <w:t xml:space="preserve"> </w:t>
-      </w:r>
-      <w:r>
-        <w:rPr>
-          <w:rStyle w:val="VerbatimChar"/>
-        </w:rPr>
-        <w:t xml:space="preserve">Workflow:&lt;name&gt;-WorkflowRunId:&lt;run id&gt;</w:t>
-      </w:r>
-      <w:r>
-        <w:t xml:space="preserve"> </w:t>
-      </w:r>
-      <w:r>
-        <w:t xml:space="preserve">for correlation.</w:t>
+        <w:t xml:space="preserve">Every log line carries </w:t>
+      </w:r>
+      <w:r>
+        <w:rPr>
+          <w:rStyle w:val="VerbatimChar"/>
+        </w:rPr>
+        <w:t>Workflow:&lt;name&gt;-WorkflowRunId:&lt;run id&gt;</w:t>
+      </w:r>
+      <w:r>
+        <w:t xml:space="preserve"> for correlation.</w:t>
       </w:r>
     </w:p>
     <w:p>
@@ -1523,7 +1278,7 @@
         <w:pStyle w:val="Compact"/>
         <w:numPr>
           <w:ilvl w:val="0"/>
-          <w:numId w:val="1006"/>
+          <w:numId w:val="7"/>
         </w:numPr>
       </w:pPr>
       <w:r>
@@ -1531,95 +1286,48 @@
           <w:b/>
           <w:bCs/>
         </w:rPr>
-        <w:t xml:space="preserve">Report-file lifecycle (R-5):</w:t>
-      </w:r>
-      <w:r>
-        <w:t xml:space="preserve"> </w:t>
-      </w:r>
-      <w:r>
-        <w:t xml:space="preserve">the generated HTML report on the PS host</w:t>
-      </w:r>
-      <w:r>
-        <w:t xml:space="preserve"> </w:t>
-      </w:r>
-      <w:r>
-        <w:t xml:space="preserve">(</w:t>
-      </w:r>
-      <w:r>
-        <w:rPr>
-          <w:rStyle w:val="VerbatimChar"/>
-        </w:rPr>
-        <w:t xml:space="preserve">$Global:DebugDir\ServerPendingRebootStatus_result.html</w:t>
-      </w:r>
-      <w:r>
-        <w:t xml:space="preserve">, plus the per-run</w:t>
-      </w:r>
-      <w:r>
-        <w:t xml:space="preserve"> </w:t>
-      </w:r>
-      <w:r>
-        <w:rPr>
-          <w:rStyle w:val="VerbatimChar"/>
-        </w:rPr>
-        <w:t xml:space="preserve">Report.html</w:t>
-      </w:r>
-      <w:r>
-        <w:t xml:space="preserve">) is written in</w:t>
-      </w:r>
-      <w:r>
-        <w:t xml:space="preserve"> </w:t>
+        <w:t>Report-file lifecycle (R-5):</w:t>
+      </w:r>
+      <w:r>
+        <w:t xml:space="preserve"> the generated HTML report on the PS host (</w:t>
+      </w:r>
+      <w:r>
+        <w:rPr>
+          <w:rStyle w:val="VerbatimChar"/>
+        </w:rPr>
+        <w:t>$Global:DebugDir\ServerPendingRebootStatus_result.html</w:t>
+      </w:r>
+      <w:r>
+        <w:t xml:space="preserve">, plus the per-run </w:t>
+      </w:r>
+      <w:r>
+        <w:rPr>
+          <w:rStyle w:val="VerbatimChar"/>
+        </w:rPr>
+        <w:t>Report.html</w:t>
+      </w:r>
+      <w:r>
+        <w:t xml:space="preserve">) is written in </w:t>
       </w:r>
       <w:r>
         <w:rPr>
           <w:b/>
           <w:bCs/>
         </w:rPr>
-        <w:t xml:space="preserve">overwrite</w:t>
-      </w:r>
-      <w:r>
-        <w:t xml:space="preserve"> </w:t>
-      </w:r>
-      <w:r>
-        <w:t xml:space="preserve">mode and is</w:t>
-      </w:r>
-      <w:r>
-        <w:t xml:space="preserve"> </w:t>
+        <w:t>overwrite</w:t>
+      </w:r>
+      <w:r>
+        <w:t xml:space="preserve"> mode and is </w:t>
       </w:r>
       <w:r>
         <w:rPr>
           <w:b/>
           <w:bCs/>
         </w:rPr>
-        <w:t xml:space="preserve">deleted after a confirmed</w:t>
-      </w:r>
-      <w:r>
-        <w:rPr>
-          <w:b/>
-          <w:bCs/>
-        </w:rPr>
-        <w:t xml:space="preserve"> </w:t>
-      </w:r>
-      <w:r>
-        <w:rPr>
-          <w:b/>
-          <w:bCs/>
-        </w:rPr>
-        <w:t xml:space="preserve">email send</w:t>
-      </w:r>
-      <w:r>
-        <w:t xml:space="preserve">. A report-only run or a failed send leaves at most one run's file</w:t>
-      </w:r>
-      <w:r>
-        <w:t xml:space="preserve"> </w:t>
-      </w:r>
-      <w:r>
-        <w:t xml:space="preserve">(overwritten next run). This bounds PS-host disk use without relying on an external</w:t>
-      </w:r>
-      <w:r>
-        <w:t xml:space="preserve"> </w:t>
-      </w:r>
-      <w:r>
-        <w:t xml:space="preserve">scheduled cleanup.</w:t>
+        <w:t>deleted after a confirmed email send</w:t>
+      </w:r>
+      <w:r>
+        <w:t>. A report-only run or a failed send leaves at most one run's file (overwritten next run). This bounds PS-host disk use without relying on an external scheduled cleanup.</w:t>
       </w:r>
     </w:p>
     <w:p>
@@ -1627,109 +1335,63 @@
         <w:pStyle w:val="Compact"/>
         <w:numPr>
           <w:ilvl w:val="0"/>
-          <w:numId w:val="1006"/>
+          <w:numId w:val="7"/>
         </w:numPr>
       </w:pPr>
       <w:r>
-        <w:t xml:space="preserve">End states:</w:t>
-      </w:r>
-      <w:r>
-        <w:t xml:space="preserve"> </w:t>
+        <w:t xml:space="preserve">End states: </w:t>
       </w:r>
       <w:r>
         <w:rPr>
           <w:b/>
           <w:bCs/>
         </w:rPr>
-        <w:t xml:space="preserve">Completed Successfully</w:t>
-      </w:r>
-      <w:r>
-        <w:t xml:space="preserve">,</w:t>
-      </w:r>
-      <w:r>
-        <w:t xml:space="preserve"> </w:t>
+        <w:t>Completed Successfully</w:t>
+      </w:r>
+      <w:r>
+        <w:t xml:space="preserve">, </w:t>
       </w:r>
       <w:r>
         <w:rPr>
           <w:b/>
           <w:bCs/>
         </w:rPr>
-        <w:t xml:space="preserve">Completed with Errors</w:t>
-      </w:r>
-      <w:r>
-        <w:t xml:space="preserve"> </w:t>
-      </w:r>
-      <w:r>
-        <w:t xml:space="preserve">(some servers</w:t>
-      </w:r>
-      <w:r>
-        <w:t xml:space="preserve"> </w:t>
-      </w:r>
-      <w:r>
-        <w:t xml:space="preserve">unqueryable; report still produced/mailed),</w:t>
-      </w:r>
-      <w:r>
-        <w:t xml:space="preserve"> </w:t>
+        <w:t>Completed with Errors</w:t>
+      </w:r>
+      <w:r>
+        <w:t xml:space="preserve"> (some servers unqueryable; report still produced/mailed), </w:t>
       </w:r>
       <w:r>
         <w:rPr>
           <w:b/>
           <w:bCs/>
         </w:rPr>
-        <w:t xml:space="preserve">Failed</w:t>
-      </w:r>
-      <w:r>
-        <w:t xml:space="preserve"> </w:t>
-      </w:r>
-      <w:r>
-        <w:t xml:space="preserve">(PS host unreachable / script</w:t>
-      </w:r>
-      <w:r>
-        <w:t xml:space="preserve"> </w:t>
-      </w:r>
-      <w:r>
-        <w:t xml:space="preserve">throws — AD module missing, group/domain unresolvable).</w:t>
-      </w:r>
-    </w:p>
-    <w:bookmarkEnd w:id="18"/>
-    <w:bookmarkEnd w:id="19"/>
+        <w:t>Failed</w:t>
+      </w:r>
+      <w:r>
+        <w:t xml:space="preserve"> (PS host unreachable / script throws — AD module missing, group/domain unresolvable).</w:t>
+      </w:r>
+      <w:bookmarkEnd w:id="0"/>
+      <w:bookmarkEnd w:id="10"/>
+    </w:p>
     <w:sectPr>
       <w:footnotePr>
         <w:numRestart w:val="eachSect"/>
       </w:footnotePr>
+      <w:pgSz w:w="12240" w:h="15840"/>
+      <w:pgMar w:top="1440" w:right="1440" w:bottom="1440" w:left="1440" w:header="720" w:footer="720" w:gutter="0"/>
+      <w:cols w:space="720"/>
     </w:sectPr>
   </w:body>
 </w:document>
 </file>
 
-<file path=word/comments.xml><?xml version="1.0" encoding="utf-8"?>
-<w:comments xmlns:w="http://schemas.openxmlformats.org/wordprocessingml/2006/main" xmlns:m="http://schemas.openxmlformats.org/officeDocument/2006/math" xmlns:r="http://schemas.openxmlformats.org/officeDocument/2006/relationships" xmlns:o="urn:schemas-microsoft-com:office:office" xmlns:v="urn:schemas-microsoft-com:vml" xmlns:w10="urn:schemas-microsoft-com:office:word" xmlns:a="http://schemas.openxmlformats.org/drawingml/2006/main" xmlns:pic="http://schemas.openxmlformats.org/drawingml/2006/picture" xmlns:wp="http://schemas.openxmlformats.org/drawingml/2006/wordprocessingDrawing"/>
-</file>
-
-<file path=word/footnotes.xml><?xml version="1.0" encoding="utf-8"?>
-<w:footnotes xmlns:w="http://schemas.openxmlformats.org/wordprocessingml/2006/main" xmlns:m="http://schemas.openxmlformats.org/officeDocument/2006/math" xmlns:r="http://schemas.openxmlformats.org/officeDocument/2006/relationships" xmlns:o="urn:schemas-microsoft-com:office:office" xmlns:v="urn:schemas-microsoft-com:vml" xmlns:w10="urn:schemas-microsoft-com:office:word" xmlns:a="http://schemas.openxmlformats.org/drawingml/2006/main" xmlns:pic="http://schemas.openxmlformats.org/drawingml/2006/picture" xmlns:wp="http://schemas.openxmlformats.org/drawingml/2006/wordprocessingDrawing">
-  <w:footnote w:type="continuationSeparator" w:id="0">
-    <w:p>
-      <w:r>
-        <w:continuationSeparator/>
-      </w:r>
-    </w:p>
-  </w:footnote>
-  <w:footnote w:type="separator" w:id="-1">
-    <w:p>
-      <w:r>
-        <w:separator/>
-      </w:r>
-    </w:p>
-  </w:footnote>
-</w:footnotes>
-</file>
-
 <file path=word/numbering.xml><?xml version="1.0" encoding="utf-8"?>
-<w:numbering xmlns:w="http://schemas.openxmlformats.org/wordprocessingml/2006/main">
-  <w:abstractNum w:abstractNumId="990">
+<w:numbering xmlns:wpc="http://schemas.microsoft.com/office/word/2010/wordprocessingCanvas" xmlns:cx="http://schemas.microsoft.com/office/drawing/2014/chartex" xmlns:cx1="http://schemas.microsoft.com/office/drawing/2015/9/8/chartex" xmlns:cx2="http://schemas.microsoft.com/office/drawing/2015/10/21/chartex" xmlns:cx3="http://schemas.microsoft.com/office/drawing/2016/5/9/chartex" xmlns:cx4="http://schemas.microsoft.com/office/drawing/2016/5/10/chartex" xmlns:cx5="http://schemas.microsoft.com/office/drawing/2016/5/11/chartex" xmlns:cx6="http://schemas.microsoft.com/office/drawing/2016/5/12/chartex" xmlns:cx7="http://schemas.microsoft.com/office/drawing/2016/5/13/chartex" xmlns:cx8="http://schemas.microsoft.com/office/drawing/2016/5/14/chartex" xmlns:mc="http://schemas.openxmlformats.org/markup-compatibility/2006" xmlns:aink="http://schemas.microsoft.com/office/drawing/2016/ink" xmlns:am3d="http://schemas.microsoft.com/office/drawing/2017/model3d" xmlns:o="urn:schemas-microsoft-com:office:office" xmlns:oel="http://schemas.microsoft.com/office/2019/extlst" xmlns:r="http://schemas.openxmlformats.org/officeDocument/2006/relationships" xmlns:m="http://schemas.openxmlformats.org/officeDocument/2006/math" xmlns:v="urn:schemas-microsoft-com:vml" xmlns:wp14="http://schemas.microsoft.com/office/word/2010/wordprocessingDrawing" xmlns:wp="http://schemas.openxmlformats.org/drawingml/2006/wordprocessingDrawing" xmlns:w10="urn:schemas-microsoft-com:office:word" xmlns:w="http://schemas.openxmlformats.org/wordprocessingml/2006/main" xmlns:w14="http://schemas.microsoft.com/office/word/2010/wordml" xmlns:w15="http://schemas.microsoft.com/office/word/2012/wordml" xmlns:w16cex="http://schemas.microsoft.com/office/word/2018/wordml/cex" xmlns:w16cid="http://schemas.microsoft.com/office/word/2016/wordml/cid" xmlns:w16="http://schemas.microsoft.com/office/word/2018/wordml" xmlns:w16du="http://schemas.microsoft.com/office/word/2023/wordml/word16du" xmlns:w16sdtdh="http://schemas.microsoft.com/office/word/2020/wordml/sdtdatahash" xmlns:w16sdtfl="http://schemas.microsoft.com/office/word/2024/wordml/sdtformatlock" xmlns:w16se="http://schemas.microsoft.com/office/word/2015/wordml/symex" xmlns:wpg="http://schemas.microsoft.com/office/word/2010/wordprocessingGroup" xmlns:wpi="http://schemas.microsoft.com/office/word/2010/wordprocessingInk" xmlns:wne="http://schemas.microsoft.com/office/word/2006/wordml" xmlns:wps="http://schemas.microsoft.com/office/word/2010/wordprocessingShape" mc:Ignorable="w14 w15 w16se w16cid w16 w16cex w16sdtdh w16sdtfl w16du wp14">
+  <w:abstractNum w:abstractNumId="0" w15:restartNumberingAfterBreak="0">
     <w:nsid w:val="0000A990"/>
     <w:multiLevelType w:val="multilevel"/>
+    <w:tmpl w:val="A39ADDF8"/>
     <w:lvl w:ilvl="0">
       <w:numFmt w:val="bullet"/>
       <w:lvlText w:val=" "/>
@@ -1803,9 +1465,10 @@
       </w:pPr>
     </w:lvl>
   </w:abstractNum>
-  <w:abstractNum w:abstractNumId="991">
+  <w:abstractNum w:abstractNumId="1" w15:restartNumberingAfterBreak="0">
     <w:nsid w:val="0000A991"/>
     <w:multiLevelType w:val="multilevel"/>
+    <w:tmpl w:val="0788555E"/>
     <w:lvl w:ilvl="0">
       <w:numFmt w:val="bullet"/>
       <w:lvlText w:val=""/>
@@ -1906,39 +1569,39 @@
       </w:rPr>
     </w:lvl>
   </w:abstractNum>
-  <w:num w:numId="1000">
-    <w:abstractNumId w:val="990"/>
+  <w:num w:numId="1" w16cid:durableId="1264612560">
+    <w:abstractNumId w:val="0"/>
   </w:num>
-  <w:num w:numId="1001">
-    <w:abstractNumId w:val="991"/>
+  <w:num w:numId="2" w16cid:durableId="849492406">
+    <w:abstractNumId w:val="1"/>
   </w:num>
-  <w:num w:numId="1002">
-    <w:abstractNumId w:val="991"/>
+  <w:num w:numId="3" w16cid:durableId="1213812638">
+    <w:abstractNumId w:val="1"/>
   </w:num>
-  <w:num w:numId="1003">
-    <w:abstractNumId w:val="991"/>
+  <w:num w:numId="4" w16cid:durableId="69693328">
+    <w:abstractNumId w:val="1"/>
   </w:num>
-  <w:num w:numId="1004">
-    <w:abstractNumId w:val="991"/>
+  <w:num w:numId="5" w16cid:durableId="1722707559">
+    <w:abstractNumId w:val="1"/>
   </w:num>
-  <w:num w:numId="1005">
-    <w:abstractNumId w:val="991"/>
+  <w:num w:numId="6" w16cid:durableId="1578635905">
+    <w:abstractNumId w:val="1"/>
   </w:num>
-  <w:num w:numId="1006">
-    <w:abstractNumId w:val="991"/>
+  <w:num w:numId="7" w16cid:durableId="1770734622">
+    <w:abstractNumId w:val="1"/>
   </w:num>
 </w:numbering>
 </file>
 
 <file path=word/styles.xml><?xml version="1.0" encoding="utf-8"?>
-<w:styles xmlns:r="http://schemas.openxmlformats.org/officeDocument/2006/relationships" xmlns:w="http://schemas.openxmlformats.org/wordprocessingml/2006/main">
+<w:styles xmlns:mc="http://schemas.openxmlformats.org/markup-compatibility/2006" xmlns:r="http://schemas.openxmlformats.org/officeDocument/2006/relationships" xmlns:w="http://schemas.openxmlformats.org/wordprocessingml/2006/main" xmlns:w14="http://schemas.microsoft.com/office/word/2010/wordml" xmlns:w15="http://schemas.microsoft.com/office/word/2012/wordml" xmlns:w16cex="http://schemas.microsoft.com/office/word/2018/wordml/cex" xmlns:w16cid="http://schemas.microsoft.com/office/word/2016/wordml/cid" xmlns:w16="http://schemas.microsoft.com/office/word/2018/wordml" xmlns:w16du="http://schemas.microsoft.com/office/word/2023/wordml/word16du" xmlns:w16sdtdh="http://schemas.microsoft.com/office/word/2020/wordml/sdtdatahash" xmlns:w16sdtfl="http://schemas.microsoft.com/office/word/2024/wordml/sdtformatlock" xmlns:w16se="http://schemas.microsoft.com/office/word/2015/wordml/symex" mc:Ignorable="w14 w15 w16se w16cid w16 w16cex w16sdtdh w16sdtfl w16du">
   <w:docDefaults>
     <w:rPrDefault>
       <w:rPr>
-        <w:rFonts w:asciiTheme="minorHAnsi" w:cstheme="minorBidi" w:eastAsiaTheme="minorEastAsia" w:hAnsiTheme="minorHAnsi"/>
+        <w:rFonts w:asciiTheme="minorHAnsi" w:eastAsiaTheme="minorEastAsia" w:hAnsiTheme="minorHAnsi" w:cstheme="minorBidi"/>
         <w:sz w:val="24"/>
         <w:szCs w:val="24"/>
-        <w:lang w:bidi="ar-SA" w:eastAsia="zh-CN" w:val="en-US"/>
+        <w:lang w:val="en-US" w:eastAsia="zh-CN" w:bidi="ar-SA"/>
       </w:rPr>
     </w:rPrDefault>
     <w:pPrDefault>
@@ -1947,168 +1610,255 @@
       </w:pPr>
     </w:pPrDefault>
   </w:docDefaults>
-  <w:latentStyles w:count="276" w:defLockedState="0" w:defQFormat="0" w:defSemiHidden="0" w:defUIPriority="0" w:defUnhideWhenUsed="0"/>
-  <w:style w:default="1" w:styleId="Normal" w:type="paragraph">
+  <w:latentStyles w:defLockedState="0" w:defUIPriority="0" w:defSemiHidden="0" w:defUnhideWhenUsed="0" w:defQFormat="0" w:count="376">
+    <w:lsdException w:name="Normal Table" w:semiHidden="1" w:unhideWhenUsed="1"/>
+    <w:lsdException w:name="Table Simple 1" w:semiHidden="1" w:unhideWhenUsed="1"/>
+    <w:lsdException w:name="Table Simple 2" w:semiHidden="1" w:unhideWhenUsed="1"/>
+    <w:lsdException w:name="Table Simple 3" w:semiHidden="1" w:unhideWhenUsed="1"/>
+    <w:lsdException w:name="Table Classic 1" w:semiHidden="1" w:unhideWhenUsed="1"/>
+    <w:lsdException w:name="Table Classic 2" w:semiHidden="1" w:unhideWhenUsed="1"/>
+    <w:lsdException w:name="Table Classic 3" w:semiHidden="1" w:unhideWhenUsed="1"/>
+    <w:lsdException w:name="Table Classic 4" w:semiHidden="1" w:unhideWhenUsed="1"/>
+    <w:lsdException w:name="Table Colorful 1" w:semiHidden="1" w:unhideWhenUsed="1"/>
+    <w:lsdException w:name="Table Colorful 2" w:semiHidden="1" w:unhideWhenUsed="1"/>
+    <w:lsdException w:name="Table Colorful 3" w:semiHidden="1" w:unhideWhenUsed="1"/>
+    <w:lsdException w:name="Table Columns 1" w:semiHidden="1" w:unhideWhenUsed="1"/>
+    <w:lsdException w:name="Table Columns 2" w:semiHidden="1" w:unhideWhenUsed="1"/>
+    <w:lsdException w:name="Table Columns 3" w:semiHidden="1" w:unhideWhenUsed="1"/>
+    <w:lsdException w:name="Table Columns 4" w:semiHidden="1" w:unhideWhenUsed="1"/>
+    <w:lsdException w:name="Table Columns 5" w:semiHidden="1" w:unhideWhenUsed="1"/>
+    <w:lsdException w:name="Table Grid 1" w:semiHidden="1" w:unhideWhenUsed="1"/>
+    <w:lsdException w:name="Table Grid 2" w:semiHidden="1" w:unhideWhenUsed="1"/>
+    <w:lsdException w:name="Table Grid 3" w:semiHidden="1" w:unhideWhenUsed="1"/>
+    <w:lsdException w:name="Table Grid 4" w:semiHidden="1" w:unhideWhenUsed="1"/>
+    <w:lsdException w:name="Table Grid 5" w:semiHidden="1" w:unhideWhenUsed="1"/>
+    <w:lsdException w:name="Table Grid 6" w:semiHidden="1" w:unhideWhenUsed="1"/>
+    <w:lsdException w:name="Table Grid 7" w:semiHidden="1" w:unhideWhenUsed="1"/>
+    <w:lsdException w:name="Table Grid 8" w:semiHidden="1" w:unhideWhenUsed="1"/>
+    <w:lsdException w:name="Table List 1" w:semiHidden="1" w:unhideWhenUsed="1"/>
+    <w:lsdException w:name="Table List 2" w:semiHidden="1" w:unhideWhenUsed="1"/>
+    <w:lsdException w:name="Table List 3" w:semiHidden="1" w:unhideWhenUsed="1"/>
+    <w:lsdException w:name="Table List 4" w:semiHidden="1" w:unhideWhenUsed="1"/>
+    <w:lsdException w:name="Table List 5" w:semiHidden="1" w:unhideWhenUsed="1"/>
+    <w:lsdException w:name="Table List 6" w:semiHidden="1" w:unhideWhenUsed="1"/>
+    <w:lsdException w:name="Table List 7" w:semiHidden="1" w:unhideWhenUsed="1"/>
+    <w:lsdException w:name="Table List 8" w:semiHidden="1" w:unhideWhenUsed="1"/>
+    <w:lsdException w:name="Table 3D effects 1" w:semiHidden="1" w:unhideWhenUsed="1"/>
+    <w:lsdException w:name="Table 3D effects 2" w:semiHidden="1" w:unhideWhenUsed="1"/>
+    <w:lsdException w:name="Table 3D effects 3" w:semiHidden="1" w:unhideWhenUsed="1"/>
+    <w:lsdException w:name="Table Contemporary" w:semiHidden="1" w:unhideWhenUsed="1"/>
+    <w:lsdException w:name="Table Elegant" w:semiHidden="1" w:unhideWhenUsed="1"/>
+    <w:lsdException w:name="Table Professional" w:semiHidden="1" w:unhideWhenUsed="1"/>
+    <w:lsdException w:name="Table Subtle 1" w:semiHidden="1" w:unhideWhenUsed="1"/>
+    <w:lsdException w:name="Table Subtle 2" w:semiHidden="1" w:unhideWhenUsed="1"/>
+    <w:lsdException w:name="Table Web 1" w:semiHidden="1" w:unhideWhenUsed="1"/>
+    <w:lsdException w:name="Table Web 2" w:semiHidden="1" w:unhideWhenUsed="1"/>
+    <w:lsdException w:name="Table Web 3" w:semiHidden="1" w:unhideWhenUsed="1"/>
+    <w:lsdException w:name="Table Theme" w:semiHidden="1" w:unhideWhenUsed="1"/>
+    <w:lsdException w:name="Light Shading"/>
+    <w:lsdException w:name="Light List"/>
+    <w:lsdException w:name="Light Grid"/>
+    <w:lsdException w:name="Medium Shading 1"/>
+    <w:lsdException w:name="Medium Shading 2"/>
+    <w:lsdException w:name="Medium List 1"/>
+    <w:lsdException w:name="Medium List 2"/>
+    <w:lsdException w:name="Medium Grid 1"/>
+    <w:lsdException w:name="Medium Grid 2"/>
+    <w:lsdException w:name="Medium Grid 3"/>
+    <w:lsdException w:name="Dark List"/>
+    <w:lsdException w:name="Colorful Shading"/>
+    <w:lsdException w:name="Colorful List"/>
+    <w:lsdException w:name="Colorful Grid"/>
+    <w:lsdException w:name="Light Shading Accent 1"/>
+    <w:lsdException w:name="Light List Accent 1"/>
+    <w:lsdException w:name="Light Grid Accent 1"/>
+    <w:lsdException w:name="Medium Shading 1 Accent 1"/>
+    <w:lsdException w:name="Medium Shading 2 Accent 1"/>
+    <w:lsdException w:name="Medium List 1 Accent 1"/>
+    <w:lsdException w:name="Medium List 2 Accent 1"/>
+    <w:lsdException w:name="Medium Grid 1 Accent 1"/>
+    <w:lsdException w:name="Medium Grid 2 Accent 1"/>
+    <w:lsdException w:name="Medium Grid 3 Accent 1"/>
+    <w:lsdException w:name="Dark List Accent 1"/>
+    <w:lsdException w:name="Colorful Shading Accent 1"/>
+    <w:lsdException w:name="Colorful List Accent 1"/>
+    <w:lsdException w:name="Colorful Grid Accent 1"/>
+    <w:lsdException w:name="Light Shading Accent 2"/>
+    <w:lsdException w:name="Light List Accent 2"/>
+    <w:lsdException w:name="Light Grid Accent 2"/>
+    <w:lsdException w:name="Medium Shading 1 Accent 2"/>
+    <w:lsdException w:name="Medium Shading 2 Accent 2"/>
+    <w:lsdException w:name="Medium List 1 Accent 2"/>
+    <w:lsdException w:name="Medium List 2 Accent 2"/>
+    <w:lsdException w:name="Medium Grid 1 Accent 2"/>
+    <w:lsdException w:name="Medium Grid 2 Accent 2"/>
+    <w:lsdException w:name="Medium Grid 3 Accent 2"/>
+    <w:lsdException w:name="Dark List Accent 2"/>
+    <w:lsdException w:name="Colorful Shading Accent 2"/>
+    <w:lsdException w:name="Colorful List Accent 2"/>
+    <w:lsdException w:name="Colorful Grid Accent 2"/>
+    <w:lsdException w:name="Light Shading Accent 3"/>
+    <w:lsdException w:name="Light List Accent 3"/>
+    <w:lsdException w:name="Light Grid Accent 3"/>
+    <w:lsdException w:name="Medium Shading 1 Accent 3"/>
+    <w:lsdException w:name="Medium Shading 2 Accent 3"/>
+    <w:lsdException w:name="Medium List 1 Accent 3"/>
+    <w:lsdException w:name="Medium List 2 Accent 3"/>
+    <w:lsdException w:name="Medium Grid 1 Accent 3"/>
+    <w:lsdException w:name="Medium Grid 2 Accent 3"/>
+    <w:lsdException w:name="Medium Grid 3 Accent 3"/>
+    <w:lsdException w:name="Dark List Accent 3"/>
+    <w:lsdException w:name="Colorful Shading Accent 3"/>
+    <w:lsdException w:name="Colorful List Accent 3"/>
+    <w:lsdException w:name="Colorful Grid Accent 3"/>
+    <w:lsdException w:name="Light Shading Accent 4"/>
+    <w:lsdException w:name="Light List Accent 4"/>
+    <w:lsdException w:name="Light Grid Accent 4"/>
+    <w:lsdException w:name="Medium Shading 1 Accent 4"/>
+    <w:lsdException w:name="Medium Shading 2 Accent 4"/>
+    <w:lsdException w:name="Medium List 1 Accent 4"/>
+    <w:lsdException w:name="Medium List 2 Accent 4"/>
+    <w:lsdException w:name="Medium Grid 1 Accent 4"/>
+    <w:lsdException w:name="Medium Grid 2 Accent 4"/>
+    <w:lsdException w:name="Medium Grid 3 Accent 4"/>
+    <w:lsdException w:name="Dark List Accent 4"/>
+    <w:lsdException w:name="Colorful Shading Accent 4"/>
+    <w:lsdException w:name="Colorful List Accent 4"/>
+    <w:lsdException w:name="Colorful Grid Accent 4"/>
+    <w:lsdException w:name="Light Shading Accent 5"/>
+    <w:lsdException w:name="Light List Accent 5"/>
+    <w:lsdException w:name="Light Grid Accent 5"/>
+    <w:lsdException w:name="Medium Shading 1 Accent 5"/>
+    <w:lsdException w:name="Medium Shading 2 Accent 5"/>
+    <w:lsdException w:name="Medium List 1 Accent 5"/>
+    <w:lsdException w:name="Medium List 2 Accent 5"/>
+    <w:lsdException w:name="Medium Grid 1 Accent 5"/>
+    <w:lsdException w:name="Medium Grid 2 Accent 5"/>
+    <w:lsdException w:name="Medium Grid 3 Accent 5"/>
+    <w:lsdException w:name="Dark List Accent 5"/>
+    <w:lsdException w:name="Colorful Shading Accent 5"/>
+    <w:lsdException w:name="Colorful List Accent 5"/>
+    <w:lsdException w:name="Colorful Grid Accent 5"/>
+    <w:lsdException w:name="Light Shading Accent 6"/>
+    <w:lsdException w:name="Light List Accent 6"/>
+    <w:lsdException w:name="Light Grid Accent 6"/>
+    <w:lsdException w:name="Medium Shading 1 Accent 6"/>
+    <w:lsdException w:name="Medium Shading 2 Accent 6"/>
+    <w:lsdException w:name="Medium List 1 Accent 6"/>
+    <w:lsdException w:name="Medium List 2 Accent 6"/>
+    <w:lsdException w:name="Medium Grid 1 Accent 6"/>
+    <w:lsdException w:name="Medium Grid 2 Accent 6"/>
+    <w:lsdException w:name="Medium Grid 3 Accent 6"/>
+    <w:lsdException w:name="Dark List Accent 6"/>
+    <w:lsdException w:name="Colorful Shading Accent 6"/>
+    <w:lsdException w:name="Colorful List Accent 6"/>
+    <w:lsdException w:name="Colorful Grid Accent 6"/>
+    <w:lsdException w:name="Grid Table 4" w:uiPriority="49"/>
+    <w:lsdException w:name="Grid Table 5 Dark" w:uiPriority="50"/>
+    <w:lsdException w:name="Grid Table 6 Colorful" w:uiPriority="51"/>
+    <w:lsdException w:name="Grid Table 7 Colorful" w:uiPriority="52"/>
+    <w:lsdException w:name="Grid Table 1 Light Accent 1" w:uiPriority="46"/>
+    <w:lsdException w:name="Grid Table 2 Accent 1" w:uiPriority="47"/>
+    <w:lsdException w:name="Grid Table 3 Accent 1" w:uiPriority="48"/>
+    <w:lsdException w:name="Grid Table 4 Accent 1" w:uiPriority="49"/>
+    <w:lsdException w:name="Grid Table 5 Dark Accent 1" w:uiPriority="50"/>
+    <w:lsdException w:name="Grid Table 6 Colorful Accent 1" w:uiPriority="51"/>
+    <w:lsdException w:name="Grid Table 7 Colorful Accent 1" w:uiPriority="52"/>
+    <w:lsdException w:name="Grid Table 1 Light Accent 2" w:uiPriority="46"/>
+    <w:lsdException w:name="Grid Table 2 Accent 2" w:uiPriority="47"/>
+    <w:lsdException w:name="Grid Table 3 Accent 2" w:uiPriority="48"/>
+    <w:lsdException w:name="Grid Table 4 Accent 2" w:uiPriority="49"/>
+    <w:lsdException w:name="Grid Table 5 Dark Accent 2" w:uiPriority="50"/>
+    <w:lsdException w:name="Grid Table 6 Colorful Accent 2" w:uiPriority="51"/>
+    <w:lsdException w:name="Grid Table 7 Colorful Accent 2" w:uiPriority="52"/>
+    <w:lsdException w:name="Grid Table 1 Light Accent 3" w:uiPriority="46"/>
+    <w:lsdException w:name="Grid Table 2 Accent 3" w:uiPriority="47"/>
+    <w:lsdException w:name="Grid Table 3 Accent 3" w:uiPriority="48"/>
+    <w:lsdException w:name="Grid Table 4 Accent 3" w:uiPriority="49"/>
+    <w:lsdException w:name="Grid Table 5 Dark Accent 3" w:uiPriority="50"/>
+    <w:lsdException w:name="Grid Table 6 Colorful Accent 3" w:uiPriority="51"/>
+    <w:lsdException w:name="Grid Table 7 Colorful Accent 3" w:uiPriority="52"/>
+    <w:lsdException w:name="Grid Table 1 Light Accent 4" w:uiPriority="46"/>
+    <w:lsdException w:name="Grid Table 2 Accent 4" w:uiPriority="47"/>
+    <w:lsdException w:name="Grid Table 3 Accent 4" w:uiPriority="48"/>
+    <w:lsdException w:name="Grid Table 4 Accent 4" w:uiPriority="49"/>
+    <w:lsdException w:name="Grid Table 5 Dark Accent 4" w:uiPriority="50"/>
+    <w:lsdException w:name="Grid Table 6 Colorful Accent 4" w:uiPriority="51"/>
+    <w:lsdException w:name="Grid Table 7 Colorful Accent 4" w:uiPriority="52"/>
+    <w:lsdException w:name="Grid Table 1 Light Accent 5" w:uiPriority="46"/>
+    <w:lsdException w:name="Grid Table 2 Accent 5" w:uiPriority="47"/>
+    <w:lsdException w:name="Grid Table 3 Accent 5" w:uiPriority="48"/>
+    <w:lsdException w:name="Grid Table 4 Accent 5" w:uiPriority="49"/>
+    <w:lsdException w:name="Grid Table 5 Dark Accent 5" w:uiPriority="50"/>
+    <w:lsdException w:name="Grid Table 6 Colorful Accent 5" w:uiPriority="51"/>
+    <w:lsdException w:name="Grid Table 7 Colorful Accent 5" w:uiPriority="52"/>
+    <w:lsdException w:name="Grid Table 1 Light Accent 6" w:uiPriority="46"/>
+    <w:lsdException w:name="Grid Table 2 Accent 6" w:uiPriority="47"/>
+    <w:lsdException w:name="Grid Table 3 Accent 6" w:uiPriority="48"/>
+    <w:lsdException w:name="Grid Table 4 Accent 6" w:uiPriority="49"/>
+    <w:lsdException w:name="Grid Table 5 Dark Accent 6" w:uiPriority="50"/>
+    <w:lsdException w:name="Grid Table 6 Colorful Accent 6" w:uiPriority="51"/>
+    <w:lsdException w:name="Grid Table 7 Colorful Accent 6" w:uiPriority="52"/>
+    <w:lsdException w:name="List Table 1 Light" w:uiPriority="46"/>
+    <w:lsdException w:name="List Table 2" w:uiPriority="47"/>
+    <w:lsdException w:name="List Table 3" w:uiPriority="48"/>
+    <w:lsdException w:name="List Table 4" w:uiPriority="49"/>
+    <w:lsdException w:name="List Table 5 Dark" w:uiPriority="50"/>
+    <w:lsdException w:name="List Table 6 Colorful" w:uiPriority="51"/>
+    <w:lsdException w:name="List Table 7 Colorful" w:uiPriority="52"/>
+    <w:lsdException w:name="List Table 1 Light Accent 1" w:uiPriority="46"/>
+    <w:lsdException w:name="List Table 2 Accent 1" w:uiPriority="47"/>
+    <w:lsdException w:name="List Table 3 Accent 1" w:uiPriority="48"/>
+    <w:lsdException w:name="List Table 4 Accent 1" w:uiPriority="49"/>
+    <w:lsdException w:name="List Table 5 Dark Accent 1" w:uiPriority="50"/>
+    <w:lsdException w:name="List Table 6 Colorful Accent 1" w:uiPriority="51"/>
+    <w:lsdException w:name="List Table 7 Colorful Accent 1" w:uiPriority="52"/>
+    <w:lsdException w:name="List Table 1 Light Accent 2" w:uiPriority="46"/>
+    <w:lsdException w:name="List Table 2 Accent 2" w:uiPriority="47"/>
+    <w:lsdException w:name="List Table 3 Accent 2" w:uiPriority="48"/>
+    <w:lsdException w:name="List Table 4 Accent 2" w:uiPriority="49"/>
+    <w:lsdException w:name="List Table 5 Dark Accent 2" w:uiPriority="50"/>
+    <w:lsdException w:name="List Table 6 Colorful Accent 2" w:uiPriority="51"/>
+    <w:lsdException w:name="List Table 7 Colorful Accent 2" w:uiPriority="52"/>
+    <w:lsdException w:name="List Table 1 Light Accent 3" w:uiPriority="46"/>
+    <w:lsdException w:name="List Table 2 Accent 3" w:uiPriority="47"/>
+    <w:lsdException w:name="List Table 3 Accent 3" w:uiPriority="48"/>
+    <w:lsdException w:name="List Table 4 Accent 3" w:uiPriority="49"/>
+    <w:lsdException w:name="List Table 5 Dark Accent 3" w:uiPriority="50"/>
+    <w:lsdException w:name="List Table 6 Colorful Accent 3" w:uiPriority="51"/>
+    <w:lsdException w:name="List Table 7 Colorful Accent 3" w:uiPriority="52"/>
+    <w:lsdException w:name="List Table 1 Light Accent 4" w:uiPriority="46"/>
+    <w:lsdException w:name="List Table 2 Accent 4" w:uiPriority="47"/>
+    <w:lsdException w:name="List Table 3 Accent 4" w:uiPriority="48"/>
+    <w:lsdException w:name="List Table 4 Accent 4" w:uiPriority="49"/>
+    <w:lsdException w:name="List Table 5 Dark Accent 4" w:uiPriority="50"/>
+    <w:lsdException w:name="List Table 6 Colorful Accent 4" w:uiPriority="51"/>
+    <w:lsdException w:name="List Table 7 Colorful Accent 4" w:uiPriority="52"/>
+    <w:lsdException w:name="List Table 1 Light Accent 5" w:uiPriority="46"/>
+    <w:lsdException w:name="List Table 2 Accent 5" w:uiPriority="47"/>
+    <w:lsdException w:name="List Table 3 Accent 5" w:uiPriority="48"/>
+    <w:lsdException w:name="List Table 4 Accent 5" w:uiPriority="49"/>
+    <w:lsdException w:name="List Table 5 Dark Accent 5" w:uiPriority="50"/>
+    <w:lsdException w:name="List Table 6 Colorful Accent 5" w:uiPriority="51"/>
+    <w:lsdException w:name="List Table 7 Colorful Accent 5" w:uiPriority="52"/>
+    <w:lsdException w:name="List Table 1 Light Accent 6" w:uiPriority="46"/>
+    <w:lsdException w:name="List Table 2 Accent 6" w:uiPriority="47"/>
+    <w:lsdException w:name="List Table 3 Accent 6" w:uiPriority="48"/>
+    <w:lsdException w:name="List Table 4 Accent 6" w:uiPriority="49"/>
+    <w:lsdException w:name="List Table 5 Dark Accent 6" w:uiPriority="50"/>
+    <w:lsdException w:name="List Table 6 Colorful Accent 6" w:uiPriority="51"/>
+    <w:lsdException w:name="List Table 7 Colorful Accent 6" w:uiPriority="52"/>
+    <w:lsdException w:name="Mention" w:semiHidden="1" w:uiPriority="99" w:unhideWhenUsed="1"/>
+    <w:lsdException w:name="Smart Hyperlink" w:semiHidden="1" w:uiPriority="99" w:unhideWhenUsed="1"/>
+    <w:lsdException w:name="Hashtag" w:semiHidden="1" w:uiPriority="99" w:unhideWhenUsed="1"/>
+    <w:lsdException w:name="Unresolved Mention" w:semiHidden="1" w:uiPriority="99" w:unhideWhenUsed="1"/>
+    <w:lsdException w:name="Smart Link" w:semiHidden="1" w:uiPriority="99" w:unhideWhenUsed="1"/>
+  </w:latentStyles>
+  <w:style w:type="paragraph" w:default="1" w:styleId="Normal">
     <w:name w:val="Normal"/>
     <w:qFormat/>
   </w:style>
-  <w:style w:styleId="BodyText" w:type="paragraph">
-    <w:name w:val="Body Text"/>
-    <w:basedOn w:val="Normal"/>
-    <w:link w:val="BodyTextChar"/>
-    <w:qFormat/>
-    <w:pPr>
-      <w:spacing w:after="180" w:before="180"/>
-    </w:pPr>
-  </w:style>
-  <w:style w:customStyle="1" w:styleId="FirstParagraph" w:type="paragraph">
-    <w:name w:val="First Paragraph"/>
-    <w:basedOn w:val="BodyText"/>
-    <w:next w:val="BodyText"/>
-    <w:qFormat/>
-  </w:style>
-  <w:style w:customStyle="1" w:styleId="Compact" w:type="paragraph">
-    <w:name w:val="Compact"/>
-    <w:basedOn w:val="BodyText"/>
-    <w:qFormat/>
-    <w:pPr>
-      <w:spacing w:after="36" w:before="36"/>
-    </w:pPr>
-  </w:style>
-  <w:style w:styleId="Title" w:type="paragraph">
-    <w:name w:val="Title"/>
-    <w:basedOn w:val="Normal"/>
-    <w:next w:val="BodyText"/>
-    <w:link w:val="TitleChar"/>
-    <w:uiPriority w:val="10"/>
-    <w:qFormat/>
-    <w:rsid w:val="00A10FD9"/>
-    <w:pPr>
-      <w:spacing w:after="80" w:line="240" w:lineRule="auto"/>
-      <w:contextualSpacing/>
-      <w:jc w:val="center"/>
-    </w:pPr>
-    <w:rPr>
-      <w:rFonts w:asciiTheme="majorHAnsi" w:cstheme="majorBidi" w:eastAsiaTheme="majorEastAsia" w:hAnsiTheme="majorHAnsi"/>
-      <w:sz w:val="56"/>
-      <w:szCs w:val="56"/>
-    </w:rPr>
-  </w:style>
-  <w:style w:customStyle="1" w:styleId="TitleChar" w:type="character">
-    <w:name w:val="Title Char"/>
-    <w:basedOn w:val="DefaultParagraphFont"/>
-    <w:link w:val="Title"/>
-    <w:uiPriority w:val="10"/>
-    <w:rsid w:val="00A10FD9"/>
-    <w:rPr>
-      <w:rFonts w:asciiTheme="majorHAnsi" w:cstheme="majorBidi" w:eastAsiaTheme="majorEastAsia" w:hAnsiTheme="majorHAnsi"/>
-      <w:sz w:val="56"/>
-      <w:szCs w:val="56"/>
-    </w:rPr>
-  </w:style>
-  <w:style w:styleId="Subtitle" w:type="paragraph">
-    <w:name w:val="Subtitle"/>
-    <w:basedOn w:val="Title"/>
-    <w:next w:val="BodyText"/>
-    <w:link w:val="SubtitleChar"/>
-    <w:uiPriority w:val="11"/>
-    <w:qFormat/>
-    <w:rsid w:val="00A10FD9"/>
-    <w:pPr>
-      <w:numPr>
-        <w:ilvl w:val="1"/>
-      </w:numPr>
-    </w:pPr>
-    <w:rPr>
-      <w:rFonts w:cstheme="majorBidi" w:eastAsiaTheme="majorEastAsia"/>
-      <w:spacing w:val="15"/>
-      <w:sz w:val="28"/>
-      <w:szCs w:val="28"/>
-    </w:rPr>
-  </w:style>
-  <w:style w:customStyle="1" w:styleId="SubtitleChar" w:type="character">
-    <w:name w:val="Subtitle Char"/>
-    <w:basedOn w:val="DefaultParagraphFont"/>
-    <w:link w:val="Subtitle"/>
-    <w:uiPriority w:val="11"/>
-    <w:rsid w:val="00A10FD9"/>
-    <w:rPr>
-      <w:rFonts w:cstheme="majorBidi" w:eastAsiaTheme="majorEastAsia"/>
-      <w:color w:themeColor="text1" w:themeTint="A6" w:val="595959"/>
-      <w:spacing w:val="15"/>
-      <w:sz w:val="28"/>
-      <w:szCs w:val="28"/>
-    </w:rPr>
-  </w:style>
-  <w:style w:customStyle="1" w:styleId="Author" w:type="paragraph">
-    <w:name w:val="Author"/>
-    <w:basedOn w:val="Title"/>
-    <w:next w:val="BodyText"/>
-    <w:qFormat/>
-    <w:pPr>
-      <w:keepNext/>
-      <w:keepLines/>
-    </w:pPr>
-    <w:rPr>
-      <w:sz w:val="24"/>
-      <w:szCs w:val="24"/>
-    </w:rPr>
-  </w:style>
-  <w:style w:styleId="Date" w:type="paragraph">
-    <w:name w:val="Date"/>
-    <w:basedOn w:val="Title"/>
-    <w:next w:val="BodyText"/>
-    <w:qFormat/>
-    <w:pPr>
-      <w:keepNext/>
-      <w:keepLines/>
-    </w:pPr>
-    <w:rPr>
-      <w:sz w:val="24"/>
-      <w:szCs w:val="24"/>
-    </w:rPr>
-  </w:style>
-  <w:style w:customStyle="1" w:styleId="AbstractTitle" w:type="paragraph">
-    <w:name w:val="Abstract Title"/>
-    <w:basedOn w:val="Normal"/>
-    <w:next w:val="Abstract"/>
-    <w:qFormat/>
-    <w:pPr>
-      <w:keepNext/>
-      <w:keepLines/>
-      <w:spacing w:after="0" w:before="300"/>
-      <w:jc w:val="center"/>
-    </w:pPr>
-    <w:rPr>
-      <w:b/>
-      <w:sz w:val="20"/>
-      <w:szCs w:val="20"/>
-    </w:rPr>
-  </w:style>
-  <w:style w:customStyle="1" w:styleId="Abstract" w:type="paragraph">
-    <w:name w:val="Abstract"/>
-    <w:basedOn w:val="Normal"/>
-    <w:next w:val="BodyText"/>
-    <w:qFormat/>
-    <w:pPr>
-      <w:keepNext/>
-      <w:keepLines/>
-      <w:spacing w:after="300" w:before="100"/>
-    </w:pPr>
-    <w:rPr>
-      <w:sz w:val="20"/>
-      <w:szCs w:val="20"/>
-    </w:rPr>
-  </w:style>
-  <w:style w:styleId="Bibliography" w:type="paragraph">
-    <w:name w:val="Bibliography"/>
-    <w:basedOn w:val="Normal"/>
-    <w:next w:val="Bibliography"/>
-    <w:qFormat/>
-    <w:pPr/>
-    <w:rPr/>
-  </w:style>
-  <w:style w:styleId="Heading1" w:type="paragraph">
+  <w:style w:type="paragraph" w:styleId="Heading1">
     <w:name w:val="heading 1"/>
     <w:basedOn w:val="Normal"/>
     <w:next w:val="BodyText"/>
@@ -2119,17 +1869,17 @@
     <w:pPr>
       <w:keepNext/>
       <w:keepLines/>
-      <w:spacing w:after="80" w:before="360"/>
+      <w:spacing w:before="360" w:after="80"/>
       <w:outlineLvl w:val="0"/>
     </w:pPr>
     <w:rPr>
-      <w:rFonts w:asciiTheme="majorHAnsi" w:cstheme="majorBidi" w:eastAsiaTheme="majorEastAsia" w:hAnsiTheme="majorHAnsi"/>
-      <w:color w:themeColor="accent1" w:themeShade="BF" w:val="0F4761"/>
+      <w:rFonts w:asciiTheme="majorHAnsi" w:eastAsiaTheme="majorEastAsia" w:hAnsiTheme="majorHAnsi" w:cstheme="majorBidi"/>
+      <w:color w:val="0F4761" w:themeColor="accent1" w:themeShade="BF"/>
       <w:sz w:val="40"/>
       <w:szCs w:val="40"/>
     </w:rPr>
   </w:style>
-  <w:style w:styleId="Heading2" w:type="paragraph">
+  <w:style w:type="paragraph" w:styleId="Heading2">
     <w:name w:val="heading 2"/>
     <w:basedOn w:val="Normal"/>
     <w:next w:val="BodyText"/>
@@ -2142,17 +1892,17 @@
     <w:pPr>
       <w:keepNext/>
       <w:keepLines/>
-      <w:spacing w:after="80" w:before="160"/>
+      <w:spacing w:before="160" w:after="80"/>
       <w:outlineLvl w:val="1"/>
     </w:pPr>
     <w:rPr>
-      <w:rFonts w:asciiTheme="majorHAnsi" w:cstheme="majorBidi" w:eastAsiaTheme="majorEastAsia" w:hAnsiTheme="majorHAnsi"/>
-      <w:color w:themeColor="accent1" w:themeShade="BF" w:val="0F4761"/>
+      <w:rFonts w:asciiTheme="majorHAnsi" w:eastAsiaTheme="majorEastAsia" w:hAnsiTheme="majorHAnsi" w:cstheme="majorBidi"/>
+      <w:color w:val="0F4761" w:themeColor="accent1" w:themeShade="BF"/>
       <w:sz w:val="32"/>
       <w:szCs w:val="32"/>
     </w:rPr>
   </w:style>
-  <w:style w:styleId="Heading3" w:type="paragraph">
+  <w:style w:type="paragraph" w:styleId="Heading3">
     <w:name w:val="heading 3"/>
     <w:basedOn w:val="Normal"/>
     <w:next w:val="BodyText"/>
@@ -2165,17 +1915,17 @@
     <w:pPr>
       <w:keepNext/>
       <w:keepLines/>
-      <w:spacing w:after="80" w:before="160"/>
+      <w:spacing w:before="160" w:after="80"/>
       <w:outlineLvl w:val="2"/>
     </w:pPr>
     <w:rPr>
-      <w:rFonts w:cstheme="majorBidi" w:eastAsiaTheme="majorEastAsia"/>
-      <w:color w:themeColor="accent1" w:themeShade="BF" w:val="0F4761"/>
+      <w:rFonts w:eastAsiaTheme="majorEastAsia" w:cstheme="majorBidi"/>
+      <w:color w:val="0F4761" w:themeColor="accent1" w:themeShade="BF"/>
       <w:sz w:val="28"/>
       <w:szCs w:val="28"/>
     </w:rPr>
   </w:style>
-  <w:style w:styleId="Heading4" w:type="paragraph">
+  <w:style w:type="paragraph" w:styleId="Heading4">
     <w:name w:val="heading 4"/>
     <w:basedOn w:val="Normal"/>
     <w:next w:val="BodyText"/>
@@ -2188,17 +1938,17 @@
     <w:pPr>
       <w:keepNext/>
       <w:keepLines/>
-      <w:spacing w:after="40" w:before="80"/>
+      <w:spacing w:before="80" w:after="40"/>
       <w:outlineLvl w:val="3"/>
     </w:pPr>
     <w:rPr>
-      <w:rFonts w:cstheme="majorBidi" w:eastAsiaTheme="majorEastAsia"/>
+      <w:rFonts w:eastAsiaTheme="majorEastAsia" w:cstheme="majorBidi"/>
       <w:i/>
       <w:iCs/>
-      <w:color w:themeColor="accent1" w:themeShade="BF" w:val="0F4761"/>
-    </w:rPr>
-  </w:style>
-  <w:style w:styleId="Heading5" w:type="paragraph">
+      <w:color w:val="0F4761" w:themeColor="accent1" w:themeShade="BF"/>
+    </w:rPr>
+  </w:style>
+  <w:style w:type="paragraph" w:styleId="Heading5">
     <w:name w:val="heading 5"/>
     <w:basedOn w:val="Normal"/>
     <w:next w:val="BodyText"/>
@@ -2211,15 +1961,15 @@
     <w:pPr>
       <w:keepNext/>
       <w:keepLines/>
-      <w:spacing w:after="40" w:before="80"/>
+      <w:spacing w:before="80" w:after="40"/>
       <w:outlineLvl w:val="4"/>
     </w:pPr>
     <w:rPr>
-      <w:rFonts w:cstheme="majorBidi" w:eastAsiaTheme="majorEastAsia"/>
-      <w:color w:themeColor="accent1" w:themeShade="BF" w:val="0F4761"/>
-    </w:rPr>
-  </w:style>
-  <w:style w:styleId="Heading6" w:type="paragraph">
+      <w:rFonts w:eastAsiaTheme="majorEastAsia" w:cstheme="majorBidi"/>
+      <w:color w:val="0F4761" w:themeColor="accent1" w:themeShade="BF"/>
+    </w:rPr>
+  </w:style>
+  <w:style w:type="paragraph" w:styleId="Heading6">
     <w:name w:val="heading 6"/>
     <w:basedOn w:val="Normal"/>
     <w:next w:val="BodyText"/>
@@ -2232,17 +1982,17 @@
     <w:pPr>
       <w:keepNext/>
       <w:keepLines/>
-      <w:spacing w:after="0" w:before="40"/>
+      <w:spacing w:before="40" w:after="0"/>
       <w:outlineLvl w:val="5"/>
     </w:pPr>
     <w:rPr>
-      <w:rFonts w:cstheme="majorBidi" w:eastAsiaTheme="majorEastAsia"/>
+      <w:rFonts w:eastAsiaTheme="majorEastAsia" w:cstheme="majorBidi"/>
       <w:i/>
       <w:iCs/>
-      <w:color w:themeColor="text1" w:themeTint="A6" w:val="595959"/>
-    </w:rPr>
-  </w:style>
-  <w:style w:styleId="Heading7" w:type="paragraph">
+      <w:color w:val="595959" w:themeColor="text1" w:themeTint="A6"/>
+    </w:rPr>
+  </w:style>
+  <w:style w:type="paragraph" w:styleId="Heading7">
     <w:name w:val="heading 7"/>
     <w:basedOn w:val="Normal"/>
     <w:next w:val="BodyText"/>
@@ -2255,15 +2005,15 @@
     <w:pPr>
       <w:keepNext/>
       <w:keepLines/>
-      <w:spacing w:after="0" w:before="40"/>
+      <w:spacing w:before="40" w:after="0"/>
       <w:outlineLvl w:val="6"/>
     </w:pPr>
     <w:rPr>
-      <w:rFonts w:cstheme="majorBidi" w:eastAsiaTheme="majorEastAsia"/>
-      <w:color w:themeColor="text1" w:themeTint="A6" w:val="595959"/>
-    </w:rPr>
-  </w:style>
-  <w:style w:styleId="Heading8" w:type="paragraph">
+      <w:rFonts w:eastAsiaTheme="majorEastAsia" w:cstheme="majorBidi"/>
+      <w:color w:val="595959" w:themeColor="text1" w:themeTint="A6"/>
+    </w:rPr>
+  </w:style>
+  <w:style w:type="paragraph" w:styleId="Heading8">
     <w:name w:val="heading 8"/>
     <w:basedOn w:val="Normal"/>
     <w:next w:val="BodyText"/>
@@ -2280,13 +2030,13 @@
       <w:outlineLvl w:val="7"/>
     </w:pPr>
     <w:rPr>
-      <w:rFonts w:cstheme="majorBidi" w:eastAsiaTheme="majorEastAsia"/>
+      <w:rFonts w:eastAsiaTheme="majorEastAsia" w:cstheme="majorBidi"/>
       <w:i/>
       <w:iCs/>
-      <w:color w:themeColor="text1" w:themeTint="D8" w:val="272727"/>
-    </w:rPr>
-  </w:style>
-  <w:style w:styleId="Heading9" w:type="paragraph">
+      <w:color w:val="272727" w:themeColor="text1" w:themeTint="D8"/>
+    </w:rPr>
+  </w:style>
+  <w:style w:type="paragraph" w:styleId="Heading9">
     <w:name w:val="heading 9"/>
     <w:basedOn w:val="Normal"/>
     <w:next w:val="BodyText"/>
@@ -2303,24 +2053,202 @@
       <w:outlineLvl w:val="8"/>
     </w:pPr>
     <w:rPr>
-      <w:rFonts w:cstheme="majorBidi" w:eastAsiaTheme="majorEastAsia"/>
-      <w:color w:themeColor="text1" w:themeTint="D8" w:val="272727"/>
-    </w:rPr>
-  </w:style>
-  <w:style w:customStyle="1" w:styleId="Heading1Char" w:type="character">
+      <w:rFonts w:eastAsiaTheme="majorEastAsia" w:cstheme="majorBidi"/>
+      <w:color w:val="272727" w:themeColor="text1" w:themeTint="D8"/>
+    </w:rPr>
+  </w:style>
+  <w:style w:type="character" w:default="1" w:styleId="DefaultParagraphFont">
+    <w:name w:val="Default Paragraph Font"/>
+    <w:uiPriority w:val="1"/>
+    <w:semiHidden/>
+    <w:unhideWhenUsed/>
+  </w:style>
+  <w:style w:type="table" w:default="1" w:styleId="TableNormal">
+    <w:name w:val="Normal Table"/>
+    <w:uiPriority w:val="99"/>
+    <w:semiHidden/>
+    <w:unhideWhenUsed/>
+    <w:tblPr>
+      <w:tblInd w:w="0" w:type="dxa"/>
+      <w:tblCellMar>
+        <w:top w:w="0" w:type="dxa"/>
+        <w:left w:w="108" w:type="dxa"/>
+        <w:bottom w:w="0" w:type="dxa"/>
+        <w:right w:w="108" w:type="dxa"/>
+      </w:tblCellMar>
+    </w:tblPr>
+  </w:style>
+  <w:style w:type="numbering" w:default="1" w:styleId="NoList">
+    <w:name w:val="No List"/>
+    <w:uiPriority w:val="99"/>
+    <w:semiHidden/>
+    <w:unhideWhenUsed/>
+  </w:style>
+  <w:style w:type="paragraph" w:styleId="BodyText">
+    <w:name w:val="Body Text"/>
+    <w:basedOn w:val="Normal"/>
+    <w:qFormat/>
+    <w:pPr>
+      <w:spacing w:before="180" w:after="180"/>
+    </w:pPr>
+  </w:style>
+  <w:style w:type="paragraph" w:customStyle="1" w:styleId="FirstParagraph">
+    <w:name w:val="First Paragraph"/>
+    <w:basedOn w:val="BodyText"/>
+    <w:next w:val="BodyText"/>
+    <w:qFormat/>
+  </w:style>
+  <w:style w:type="paragraph" w:customStyle="1" w:styleId="Compact">
+    <w:name w:val="Compact"/>
+    <w:basedOn w:val="BodyText"/>
+    <w:qFormat/>
+    <w:pPr>
+      <w:spacing w:before="36" w:after="36"/>
+    </w:pPr>
+  </w:style>
+  <w:style w:type="paragraph" w:styleId="Title">
+    <w:name w:val="Title"/>
+    <w:basedOn w:val="Normal"/>
+    <w:next w:val="BodyText"/>
+    <w:link w:val="TitleChar"/>
+    <w:uiPriority w:val="10"/>
+    <w:qFormat/>
+    <w:rsid w:val="00A10FD9"/>
+    <w:pPr>
+      <w:spacing w:after="80"/>
+      <w:contextualSpacing/>
+      <w:jc w:val="center"/>
+    </w:pPr>
+    <w:rPr>
+      <w:rFonts w:asciiTheme="majorHAnsi" w:eastAsiaTheme="majorEastAsia" w:hAnsiTheme="majorHAnsi" w:cstheme="majorBidi"/>
+      <w:sz w:val="56"/>
+      <w:szCs w:val="56"/>
+    </w:rPr>
+  </w:style>
+  <w:style w:type="character" w:customStyle="1" w:styleId="TitleChar">
+    <w:name w:val="Title Char"/>
+    <w:basedOn w:val="DefaultParagraphFont"/>
+    <w:link w:val="Title"/>
+    <w:uiPriority w:val="10"/>
+    <w:rsid w:val="00A10FD9"/>
+    <w:rPr>
+      <w:rFonts w:asciiTheme="majorHAnsi" w:eastAsiaTheme="majorEastAsia" w:hAnsiTheme="majorHAnsi" w:cstheme="majorBidi"/>
+      <w:sz w:val="56"/>
+      <w:szCs w:val="56"/>
+    </w:rPr>
+  </w:style>
+  <w:style w:type="paragraph" w:styleId="Subtitle">
+    <w:name w:val="Subtitle"/>
+    <w:basedOn w:val="Title"/>
+    <w:next w:val="BodyText"/>
+    <w:link w:val="SubtitleChar"/>
+    <w:uiPriority w:val="11"/>
+    <w:qFormat/>
+    <w:rsid w:val="00A10FD9"/>
+    <w:pPr>
+      <w:numPr>
+        <w:ilvl w:val="1"/>
+      </w:numPr>
+    </w:pPr>
+    <w:rPr>
+      <w:spacing w:val="15"/>
+      <w:sz w:val="28"/>
+      <w:szCs w:val="28"/>
+    </w:rPr>
+  </w:style>
+  <w:style w:type="character" w:customStyle="1" w:styleId="SubtitleChar">
+    <w:name w:val="Subtitle Char"/>
+    <w:basedOn w:val="DefaultParagraphFont"/>
+    <w:link w:val="Subtitle"/>
+    <w:uiPriority w:val="11"/>
+    <w:rsid w:val="00A10FD9"/>
+    <w:rPr>
+      <w:rFonts w:eastAsiaTheme="majorEastAsia" w:cstheme="majorBidi"/>
+      <w:color w:val="595959" w:themeColor="text1" w:themeTint="A6"/>
+      <w:spacing w:val="15"/>
+      <w:sz w:val="28"/>
+      <w:szCs w:val="28"/>
+    </w:rPr>
+  </w:style>
+  <w:style w:type="paragraph" w:customStyle="1" w:styleId="Author">
+    <w:name w:val="Author"/>
+    <w:basedOn w:val="Title"/>
+    <w:next w:val="BodyText"/>
+    <w:qFormat/>
+    <w:pPr>
+      <w:keepNext/>
+      <w:keepLines/>
+    </w:pPr>
+    <w:rPr>
+      <w:sz w:val="24"/>
+      <w:szCs w:val="24"/>
+    </w:rPr>
+  </w:style>
+  <w:style w:type="paragraph" w:styleId="Date">
+    <w:name w:val="Date"/>
+    <w:basedOn w:val="Title"/>
+    <w:next w:val="BodyText"/>
+    <w:qFormat/>
+    <w:pPr>
+      <w:keepNext/>
+      <w:keepLines/>
+    </w:pPr>
+    <w:rPr>
+      <w:sz w:val="24"/>
+      <w:szCs w:val="24"/>
+    </w:rPr>
+  </w:style>
+  <w:style w:type="paragraph" w:customStyle="1" w:styleId="AbstractTitle">
+    <w:name w:val="Abstract Title"/>
+    <w:basedOn w:val="Normal"/>
+    <w:next w:val="Abstract"/>
+    <w:qFormat/>
+    <w:pPr>
+      <w:keepNext/>
+      <w:keepLines/>
+      <w:spacing w:before="300" w:after="0"/>
+      <w:jc w:val="center"/>
+    </w:pPr>
+    <w:rPr>
+      <w:b/>
+      <w:sz w:val="20"/>
+      <w:szCs w:val="20"/>
+    </w:rPr>
+  </w:style>
+  <w:style w:type="paragraph" w:customStyle="1" w:styleId="Abstract">
+    <w:name w:val="Abstract"/>
+    <w:basedOn w:val="Normal"/>
+    <w:next w:val="BodyText"/>
+    <w:qFormat/>
+    <w:pPr>
+      <w:keepNext/>
+      <w:keepLines/>
+      <w:spacing w:before="100" w:after="300"/>
+    </w:pPr>
+    <w:rPr>
+      <w:sz w:val="20"/>
+      <w:szCs w:val="20"/>
+    </w:rPr>
+  </w:style>
+  <w:style w:type="paragraph" w:styleId="Bibliography">
+    <w:name w:val="Bibliography"/>
+    <w:basedOn w:val="Normal"/>
+    <w:qFormat/>
+  </w:style>
+  <w:style w:type="character" w:customStyle="1" w:styleId="Heading1Char">
     <w:name w:val="Heading 1 Char"/>
     <w:basedOn w:val="DefaultParagraphFont"/>
     <w:link w:val="Heading1"/>
     <w:uiPriority w:val="9"/>
     <w:rsid w:val="00A10FD9"/>
     <w:rPr>
-      <w:rFonts w:asciiTheme="majorHAnsi" w:cstheme="majorBidi" w:eastAsiaTheme="majorEastAsia" w:hAnsiTheme="majorHAnsi"/>
-      <w:color w:themeColor="accent1" w:themeShade="BF" w:val="0F4761"/>
+      <w:rFonts w:asciiTheme="majorHAnsi" w:eastAsiaTheme="majorEastAsia" w:hAnsiTheme="majorHAnsi" w:cstheme="majorBidi"/>
+      <w:color w:val="0F4761" w:themeColor="accent1" w:themeShade="BF"/>
       <w:sz w:val="40"/>
       <w:szCs w:val="40"/>
     </w:rPr>
   </w:style>
-  <w:style w:customStyle="1" w:styleId="Heading2Char" w:type="character">
+  <w:style w:type="character" w:customStyle="1" w:styleId="Heading2Char">
     <w:name w:val="Heading 2 Char"/>
     <w:basedOn w:val="DefaultParagraphFont"/>
     <w:link w:val="Heading2"/>
@@ -2328,13 +2256,13 @@
     <w:semiHidden/>
     <w:rsid w:val="00A10FD9"/>
     <w:rPr>
-      <w:rFonts w:asciiTheme="majorHAnsi" w:cstheme="majorBidi" w:eastAsiaTheme="majorEastAsia" w:hAnsiTheme="majorHAnsi"/>
-      <w:color w:themeColor="accent1" w:themeShade="BF" w:val="0F4761"/>
+      <w:rFonts w:asciiTheme="majorHAnsi" w:eastAsiaTheme="majorEastAsia" w:hAnsiTheme="majorHAnsi" w:cstheme="majorBidi"/>
+      <w:color w:val="0F4761" w:themeColor="accent1" w:themeShade="BF"/>
       <w:sz w:val="32"/>
       <w:szCs w:val="32"/>
     </w:rPr>
   </w:style>
-  <w:style w:customStyle="1" w:styleId="Heading3Char" w:type="character">
+  <w:style w:type="character" w:customStyle="1" w:styleId="Heading3Char">
     <w:name w:val="Heading 3 Char"/>
     <w:basedOn w:val="DefaultParagraphFont"/>
     <w:link w:val="Heading3"/>
@@ -2342,13 +2270,13 @@
     <w:semiHidden/>
     <w:rsid w:val="00A10FD9"/>
     <w:rPr>
-      <w:rFonts w:cstheme="majorBidi" w:eastAsiaTheme="majorEastAsia"/>
-      <w:color w:themeColor="accent1" w:themeShade="BF" w:val="0F4761"/>
+      <w:rFonts w:eastAsiaTheme="majorEastAsia" w:cstheme="majorBidi"/>
+      <w:color w:val="0F4761" w:themeColor="accent1" w:themeShade="BF"/>
       <w:sz w:val="28"/>
       <w:szCs w:val="28"/>
     </w:rPr>
   </w:style>
-  <w:style w:customStyle="1" w:styleId="Heading4Char" w:type="character">
+  <w:style w:type="character" w:customStyle="1" w:styleId="Heading4Char">
     <w:name w:val="Heading 4 Char"/>
     <w:basedOn w:val="DefaultParagraphFont"/>
     <w:link w:val="Heading4"/>
@@ -2356,13 +2284,13 @@
     <w:semiHidden/>
     <w:rsid w:val="00A10FD9"/>
     <w:rPr>
-      <w:rFonts w:cstheme="majorBidi" w:eastAsiaTheme="majorEastAsia"/>
+      <w:rFonts w:eastAsiaTheme="majorEastAsia" w:cstheme="majorBidi"/>
       <w:i/>
       <w:iCs/>
-      <w:color w:themeColor="accent1" w:themeShade="BF" w:val="0F4761"/>
-    </w:rPr>
-  </w:style>
-  <w:style w:customStyle="1" w:styleId="Heading5Char" w:type="character">
+      <w:color w:val="0F4761" w:themeColor="accent1" w:themeShade="BF"/>
+    </w:rPr>
+  </w:style>
+  <w:style w:type="character" w:customStyle="1" w:styleId="Heading5Char">
     <w:name w:val="Heading 5 Char"/>
     <w:basedOn w:val="DefaultParagraphFont"/>
     <w:link w:val="Heading5"/>
@@ -2370,11 +2298,11 @@
     <w:semiHidden/>
     <w:rsid w:val="00A10FD9"/>
     <w:rPr>
-      <w:rFonts w:cstheme="majorBidi" w:eastAsiaTheme="majorEastAsia"/>
-      <w:color w:themeColor="accent1" w:themeShade="BF" w:val="0F4761"/>
-    </w:rPr>
-  </w:style>
-  <w:style w:customStyle="1" w:styleId="Heading6Char" w:type="character">
+      <w:rFonts w:eastAsiaTheme="majorEastAsia" w:cstheme="majorBidi"/>
+      <w:color w:val="0F4761" w:themeColor="accent1" w:themeShade="BF"/>
+    </w:rPr>
+  </w:style>
+  <w:style w:type="character" w:customStyle="1" w:styleId="Heading6Char">
     <w:name w:val="Heading 6 Char"/>
     <w:basedOn w:val="DefaultParagraphFont"/>
     <w:link w:val="Heading6"/>
@@ -2382,13 +2310,13 @@
     <w:semiHidden/>
     <w:rsid w:val="00A10FD9"/>
     <w:rPr>
-      <w:rFonts w:cstheme="majorBidi" w:eastAsiaTheme="majorEastAsia"/>
+      <w:rFonts w:eastAsiaTheme="majorEastAsia" w:cstheme="majorBidi"/>
       <w:i/>
       <w:iCs/>
-      <w:color w:themeColor="text1" w:themeTint="A6" w:val="595959"/>
-    </w:rPr>
-  </w:style>
-  <w:style w:customStyle="1" w:styleId="Heading7Char" w:type="character">
+      <w:color w:val="595959" w:themeColor="text1" w:themeTint="A6"/>
+    </w:rPr>
+  </w:style>
+  <w:style w:type="character" w:customStyle="1" w:styleId="Heading7Char">
     <w:name w:val="Heading 7 Char"/>
     <w:basedOn w:val="DefaultParagraphFont"/>
     <w:link w:val="Heading7"/>
@@ -2396,11 +2324,11 @@
     <w:semiHidden/>
     <w:rsid w:val="00A10FD9"/>
     <w:rPr>
-      <w:rFonts w:cstheme="majorBidi" w:eastAsiaTheme="majorEastAsia"/>
-      <w:color w:themeColor="text1" w:themeTint="A6" w:val="595959"/>
-    </w:rPr>
-  </w:style>
-  <w:style w:customStyle="1" w:styleId="Heading8Char" w:type="character">
+      <w:rFonts w:eastAsiaTheme="majorEastAsia" w:cstheme="majorBidi"/>
+      <w:color w:val="595959" w:themeColor="text1" w:themeTint="A6"/>
+    </w:rPr>
+  </w:style>
+  <w:style w:type="character" w:customStyle="1" w:styleId="Heading8Char">
     <w:name w:val="Heading 8 Char"/>
     <w:basedOn w:val="DefaultParagraphFont"/>
     <w:link w:val="Heading8"/>
@@ -2408,13 +2336,13 @@
     <w:semiHidden/>
     <w:rsid w:val="00A10FD9"/>
     <w:rPr>
-      <w:rFonts w:cstheme="majorBidi" w:eastAsiaTheme="majorEastAsia"/>
+      <w:rFonts w:eastAsiaTheme="majorEastAsia" w:cstheme="majorBidi"/>
       <w:i/>
       <w:iCs/>
-      <w:color w:themeColor="text1" w:themeTint="D8" w:val="272727"/>
-    </w:rPr>
-  </w:style>
-  <w:style w:customStyle="1" w:styleId="Heading9Char" w:type="character">
+      <w:color w:val="272727" w:themeColor="text1" w:themeTint="D8"/>
+    </w:rPr>
+  </w:style>
+  <w:style w:type="character" w:customStyle="1" w:styleId="Heading9Char">
     <w:name w:val="Heading 9 Char"/>
     <w:basedOn w:val="DefaultParagraphFont"/>
     <w:link w:val="Heading9"/>
@@ -2422,11 +2350,11 @@
     <w:semiHidden/>
     <w:rsid w:val="00A10FD9"/>
     <w:rPr>
-      <w:rFonts w:cstheme="majorBidi" w:eastAsiaTheme="majorEastAsia"/>
-      <w:color w:themeColor="text1" w:themeTint="D8" w:val="272727"/>
-    </w:rPr>
-  </w:style>
-  <w:style w:styleId="BlockText" w:type="paragraph">
+      <w:rFonts w:eastAsiaTheme="majorEastAsia" w:cstheme="majorBidi"/>
+      <w:color w:val="272727" w:themeColor="text1" w:themeTint="D8"/>
+    </w:rPr>
+  </w:style>
+  <w:style w:type="paragraph" w:styleId="BlockText">
     <w:name w:val="Block Text"/>
     <w:basedOn w:val="BodyText"/>
     <w:next w:val="BodyText"/>
@@ -2434,19 +2362,18 @@
     <w:unhideWhenUsed/>
     <w:qFormat/>
     <w:pPr>
-      <w:spacing w:after="100" w:before="100"/>
-      <w:ind w:firstLine="0" w:left="480" w:right="480"/>
+      <w:spacing w:before="100" w:after="100"/>
+      <w:ind w:left="480" w:right="480"/>
     </w:pPr>
   </w:style>
-  <w:style w:styleId="FootnoteText" w:type="paragraph">
-    <w:name w:val="Footnote Text"/>
+  <w:style w:type="paragraph" w:styleId="FootnoteText">
+    <w:name w:val="footnote text"/>
     <w:basedOn w:val="Normal"/>
-    <w:next w:val="FootnoteText"/>
     <w:uiPriority w:val="9"/>
     <w:unhideWhenUsed/>
     <w:qFormat/>
   </w:style>
-  <w:style w:styleId="FootnoteBlockText" w:type="paragraph">
+  <w:style w:type="paragraph" w:customStyle="1" w:styleId="FootnoteBlockText">
     <w:name w:val="Footnote Block Text"/>
     <w:basedOn w:val="FootnoteText"/>
     <w:next w:val="FootnoteText"/>
@@ -2454,40 +2381,35 @@
     <w:unhideWhenUsed/>
     <w:qFormat/>
     <w:pPr>
-      <w:spacing w:after="100" w:before="100"/>
-      <w:ind w:firstLine="0" w:left="480" w:right="480"/>
+      <w:spacing w:before="100" w:after="100"/>
+      <w:ind w:left="480" w:right="480"/>
     </w:pPr>
   </w:style>
-  <w:style w:default="1" w:styleId="DefaultParagraphFont" w:type="character">
-    <w:name w:val="Default Paragraph Font"/>
-    <w:semiHidden/>
-    <w:unhideWhenUsed/>
-  </w:style>
-  <w:style w:default="1" w:styleId="Table" w:type="table">
+  <w:style w:type="table" w:customStyle="1" w:styleId="Table">
     <w:name w:val="Table"/>
-    <w:basedOn w:val="TableNormal"/>
     <w:semiHidden/>
     <w:unhideWhenUsed/>
     <w:qFormat/>
     <w:tblPr>
-      <w:tblInd w:type="dxa" w:w="0"/>
+      <w:tblInd w:w="0" w:type="dxa"/>
       <w:tblCellMar>
-        <w:top w:type="dxa" w:w="0"/>
-        <w:left w:type="dxa" w:w="108"/>
-        <w:bottom w:type="dxa" w:w="0"/>
-        <w:right w:type="dxa" w:w="108"/>
+        <w:top w:w="0" w:type="dxa"/>
+        <w:left w:w="108" w:type="dxa"/>
+        <w:bottom w:w="0" w:type="dxa"/>
+        <w:right w:w="108" w:type="dxa"/>
       </w:tblCellMar>
     </w:tblPr>
     <w:tblStylePr w:type="firstRow">
+      <w:tblPr/>
       <w:tcPr>
         <w:tcBorders>
-          <w:bottom w:val="single"/>
+          <w:bottom w:val="single" w:sz="0" w:space="0" w:color="auto"/>
         </w:tcBorders>
         <w:vAlign w:val="bottom"/>
       </w:tcPr>
     </w:tblStylePr>
   </w:style>
-  <w:style w:customStyle="1" w:styleId="DefinitionTerm" w:type="paragraph">
+  <w:style w:type="paragraph" w:customStyle="1" w:styleId="DefinitionTerm">
     <w:name w:val="Definition Term"/>
     <w:basedOn w:val="Normal"/>
     <w:next w:val="Definition"/>
@@ -2500,75 +2422,76 @@
       <w:b/>
     </w:rPr>
   </w:style>
-  <w:style w:customStyle="1" w:styleId="Definition" w:type="paragraph">
+  <w:style w:type="paragraph" w:customStyle="1" w:styleId="Definition">
     <w:name w:val="Definition"/>
     <w:basedOn w:val="Normal"/>
   </w:style>
-  <w:style w:styleId="Caption" w:type="paragraph">
-    <w:name w:val="Caption"/>
+  <w:style w:type="paragraph" w:styleId="Caption">
+    <w:name w:val="caption"/>
     <w:basedOn w:val="Normal"/>
-    <w:link w:val="BodyTextChar"/>
+    <w:link w:val="CaptionChar"/>
     <w:pPr>
-      <w:spacing w:after="120" w:before="0"/>
+      <w:spacing w:after="120"/>
     </w:pPr>
     <w:rPr>
       <w:i/>
     </w:rPr>
   </w:style>
-  <w:style w:customStyle="1" w:styleId="TableCaption" w:type="paragraph">
+  <w:style w:type="paragraph" w:customStyle="1" w:styleId="TableCaption">
     <w:name w:val="Table Caption"/>
     <w:basedOn w:val="Caption"/>
     <w:pPr>
       <w:keepNext/>
     </w:pPr>
   </w:style>
-  <w:style w:customStyle="1" w:styleId="ImageCaption" w:type="paragraph">
+  <w:style w:type="paragraph" w:customStyle="1" w:styleId="ImageCaption">
     <w:name w:val="Image Caption"/>
     <w:basedOn w:val="Caption"/>
   </w:style>
-  <w:style w:customStyle="1" w:styleId="Figure" w:type="paragraph">
+  <w:style w:type="paragraph" w:customStyle="1" w:styleId="Figure">
     <w:name w:val="Figure"/>
     <w:basedOn w:val="Normal"/>
   </w:style>
-  <w:style w:customStyle="1" w:styleId="CaptionedFigure" w:type="paragraph">
+  <w:style w:type="paragraph" w:customStyle="1" w:styleId="CaptionedFigure">
     <w:name w:val="Captioned Figure"/>
     <w:basedOn w:val="Figure"/>
     <w:pPr>
       <w:keepNext/>
     </w:pPr>
   </w:style>
-  <w:style w:customStyle="1" w:styleId="BodyTextChar" w:type="character">
-    <w:name w:val="Body Text Char"/>
+  <w:style w:type="character" w:customStyle="1" w:styleId="CaptionChar">
+    <w:name w:val="Caption Char"/>
     <w:basedOn w:val="DefaultParagraphFont"/>
-    <w:link w:val="BodyText"/>
-  </w:style>
-  <w:style w:customStyle="1" w:styleId="VerbatimChar" w:type="character">
+    <w:link w:val="Caption"/>
+  </w:style>
+  <w:style w:type="character" w:customStyle="1" w:styleId="VerbatimChar">
     <w:name w:val="Verbatim Char"/>
-    <w:basedOn w:val="BodyTextChar"/>
+    <w:basedOn w:val="CaptionChar"/>
+    <w:link w:val="SourceCode"/>
     <w:rPr>
       <w:rFonts w:ascii="Consolas" w:hAnsi="Consolas"/>
       <w:sz w:val="22"/>
     </w:rPr>
   </w:style>
-  <w:style w:customStyle="1" w:styleId="SectionNumber" w:type="character">
+  <w:style w:type="character" w:customStyle="1" w:styleId="SectionNumber">
     <w:name w:val="Section Number"/>
-    <w:basedOn w:val="BodyTextChar"/>
-  </w:style>
-  <w:style w:styleId="FootnoteReference" w:type="character">
-    <w:name w:val="Footnote Reference"/>
-    <w:basedOn w:val="BodyTextChar"/>
+    <w:basedOn w:val="CaptionChar"/>
+  </w:style>
+  <w:style w:type="character" w:styleId="FootnoteReference">
+    <w:name w:val="footnote reference"/>
+    <w:basedOn w:val="CaptionChar"/>
     <w:rPr>
       <w:vertAlign w:val="superscript"/>
     </w:rPr>
   </w:style>
-  <w:style w:styleId="Hyperlink" w:type="character">
+  <w:style w:type="character" w:styleId="Hyperlink">
     <w:name w:val="Hyperlink"/>
-    <w:basedOn w:val="BodyTextChar"/>
-    <w:rPr>
-      <w:color w:themeColor="accent1" w:val="4F81BD"/>
-    </w:rPr>
-  </w:style>
-  <w:style w:styleId="TOCHeading" w:type="paragraph">
+    <w:basedOn w:val="CaptionChar"/>
+    <w:rPr>
+      <w:color w:val="156082" w:themeColor="accent1"/>
+    </w:rPr>
+  </w:style>
+  <w:style w:type="paragraph" w:styleId="TOCHeading">
     <w:name w:val="TOC Heading"/>
     <w:basedOn w:val="Heading1"/>
     <w:next w:val="BodyText"/>
@@ -2579,246 +2502,305 @@
       <w:spacing w:before="240" w:line="259" w:lineRule="auto"/>
       <w:outlineLvl w:val="9"/>
     </w:pPr>
-    <w:rPr>
-      <w:rFonts w:asciiTheme="majorHAnsi" w:cstheme="majorBidi" w:eastAsiaTheme="majorEastAsia" w:hAnsiTheme="majorHAnsi"/>
-      <w:b w:val="0"/>
-      <w:bCs w:val="0"/>
-      <w:color w:themeColor="accent1" w:themeShade="BF" w:val="365F91"/>
-    </w:rPr>
   </w:style>
   <w:style w:type="paragraph" w:customStyle="1" w:styleId="SourceCode">
     <w:name w:val="Source Code"/>
     <w:basedOn w:val="Normal"/>
     <w:link w:val="VerbatimChar"/>
     <w:pPr>
-      <w:wordWrap w:val="off"/>
+      <w:wordWrap w:val="0"/>
     </w:pPr>
   </w:style>
   <w:style w:type="character" w:customStyle="1" w:styleId="KeywordTok">
     <w:name w:val="KeywordTok"/>
     <w:basedOn w:val="VerbatimChar"/>
     <w:rPr>
+      <w:rFonts w:ascii="Consolas" w:hAnsi="Consolas"/>
       <w:b/>
       <w:color w:val="007020"/>
+      <w:sz w:val="22"/>
     </w:rPr>
   </w:style>
   <w:style w:type="character" w:customStyle="1" w:styleId="DataTypeTok">
     <w:name w:val="DataTypeTok"/>
     <w:basedOn w:val="VerbatimChar"/>
     <w:rPr>
+      <w:rFonts w:ascii="Consolas" w:hAnsi="Consolas"/>
       <w:color w:val="902000"/>
+      <w:sz w:val="22"/>
     </w:rPr>
   </w:style>
   <w:style w:type="character" w:customStyle="1" w:styleId="DecValTok">
     <w:name w:val="DecValTok"/>
     <w:basedOn w:val="VerbatimChar"/>
     <w:rPr>
-      <w:color w:val="40a070"/>
+      <w:rFonts w:ascii="Consolas" w:hAnsi="Consolas"/>
+      <w:color w:val="40A070"/>
+      <w:sz w:val="22"/>
     </w:rPr>
   </w:style>
   <w:style w:type="character" w:customStyle="1" w:styleId="BaseNTok">
     <w:name w:val="BaseNTok"/>
     <w:basedOn w:val="VerbatimChar"/>
     <w:rPr>
-      <w:color w:val="40a070"/>
+      <w:rFonts w:ascii="Consolas" w:hAnsi="Consolas"/>
+      <w:color w:val="40A070"/>
+      <w:sz w:val="22"/>
     </w:rPr>
   </w:style>
   <w:style w:type="character" w:customStyle="1" w:styleId="FloatTok">
     <w:name w:val="FloatTok"/>
     <w:basedOn w:val="VerbatimChar"/>
     <w:rPr>
-      <w:color w:val="40a070"/>
+      <w:rFonts w:ascii="Consolas" w:hAnsi="Consolas"/>
+      <w:color w:val="40A070"/>
+      <w:sz w:val="22"/>
     </w:rPr>
   </w:style>
   <w:style w:type="character" w:customStyle="1" w:styleId="ConstantTok">
     <w:name w:val="ConstantTok"/>
     <w:basedOn w:val="VerbatimChar"/>
     <w:rPr>
+      <w:rFonts w:ascii="Consolas" w:hAnsi="Consolas"/>
       <w:color w:val="880000"/>
+      <w:sz w:val="22"/>
     </w:rPr>
   </w:style>
   <w:style w:type="character" w:customStyle="1" w:styleId="CharTok">
     <w:name w:val="CharTok"/>
     <w:basedOn w:val="VerbatimChar"/>
     <w:rPr>
-      <w:color w:val="4070a0"/>
+      <w:rFonts w:ascii="Consolas" w:hAnsi="Consolas"/>
+      <w:color w:val="4070A0"/>
+      <w:sz w:val="22"/>
     </w:rPr>
   </w:style>
   <w:style w:type="character" w:customStyle="1" w:styleId="SpecialCharTok">
     <w:name w:val="SpecialCharTok"/>
     <w:basedOn w:val="VerbatimChar"/>
     <w:rPr>
-      <w:color w:val="4070a0"/>
+      <w:rFonts w:ascii="Consolas" w:hAnsi="Consolas"/>
+      <w:color w:val="4070A0"/>
+      <w:sz w:val="22"/>
     </w:rPr>
   </w:style>
   <w:style w:type="character" w:customStyle="1" w:styleId="StringTok">
     <w:name w:val="StringTok"/>
     <w:basedOn w:val="VerbatimChar"/>
     <w:rPr>
-      <w:color w:val="4070a0"/>
+      <w:rFonts w:ascii="Consolas" w:hAnsi="Consolas"/>
+      <w:color w:val="4070A0"/>
+      <w:sz w:val="22"/>
     </w:rPr>
   </w:style>
   <w:style w:type="character" w:customStyle="1" w:styleId="VerbatimStringTok">
     <w:name w:val="VerbatimStringTok"/>
     <w:basedOn w:val="VerbatimChar"/>
     <w:rPr>
-      <w:color w:val="4070a0"/>
+      <w:rFonts w:ascii="Consolas" w:hAnsi="Consolas"/>
+      <w:color w:val="4070A0"/>
+      <w:sz w:val="22"/>
     </w:rPr>
   </w:style>
   <w:style w:type="character" w:customStyle="1" w:styleId="SpecialStringTok">
     <w:name w:val="SpecialStringTok"/>
     <w:basedOn w:val="VerbatimChar"/>
     <w:rPr>
-      <w:color w:val="bb6688"/>
+      <w:rFonts w:ascii="Consolas" w:hAnsi="Consolas"/>
+      <w:color w:val="BB6688"/>
+      <w:sz w:val="22"/>
     </w:rPr>
   </w:style>
   <w:style w:type="character" w:customStyle="1" w:styleId="ImportTok">
     <w:name w:val="ImportTok"/>
     <w:basedOn w:val="VerbatimChar"/>
     <w:rPr>
+      <w:rFonts w:ascii="Consolas" w:hAnsi="Consolas"/>
       <w:b/>
       <w:color w:val="008000"/>
+      <w:sz w:val="22"/>
     </w:rPr>
   </w:style>
   <w:style w:type="character" w:customStyle="1" w:styleId="CommentTok">
     <w:name w:val="CommentTok"/>
     <w:basedOn w:val="VerbatimChar"/>
     <w:rPr>
+      <w:rFonts w:ascii="Consolas" w:hAnsi="Consolas"/>
       <w:i/>
-      <w:color w:val="60a0b0"/>
+      <w:color w:val="60A0B0"/>
+      <w:sz w:val="22"/>
     </w:rPr>
   </w:style>
   <w:style w:type="character" w:customStyle="1" w:styleId="DocumentationTok">
     <w:name w:val="DocumentationTok"/>
     <w:basedOn w:val="VerbatimChar"/>
     <w:rPr>
+      <w:rFonts w:ascii="Consolas" w:hAnsi="Consolas"/>
       <w:i/>
-      <w:color w:val="ba2121"/>
+      <w:color w:val="BA2121"/>
+      <w:sz w:val="22"/>
     </w:rPr>
   </w:style>
   <w:style w:type="character" w:customStyle="1" w:styleId="AnnotationTok">
     <w:name w:val="AnnotationTok"/>
     <w:basedOn w:val="VerbatimChar"/>
     <w:rPr>
+      <w:rFonts w:ascii="Consolas" w:hAnsi="Consolas"/>
       <w:b/>
       <w:i/>
-      <w:color w:val="60a0b0"/>
+      <w:color w:val="60A0B0"/>
+      <w:sz w:val="22"/>
     </w:rPr>
   </w:style>
   <w:style w:type="character" w:customStyle="1" w:styleId="CommentVarTok">
     <w:name w:val="CommentVarTok"/>
     <w:basedOn w:val="VerbatimChar"/>
     <w:rPr>
+      <w:rFonts w:ascii="Consolas" w:hAnsi="Consolas"/>
       <w:b/>
       <w:i/>
-      <w:color w:val="60a0b0"/>
+      <w:color w:val="60A0B0"/>
+      <w:sz w:val="22"/>
     </w:rPr>
   </w:style>
   <w:style w:type="character" w:customStyle="1" w:styleId="OtherTok">
     <w:name w:val="OtherTok"/>
     <w:basedOn w:val="VerbatimChar"/>
     <w:rPr>
+      <w:rFonts w:ascii="Consolas" w:hAnsi="Consolas"/>
       <w:color w:val="007020"/>
+      <w:sz w:val="22"/>
     </w:rPr>
   </w:style>
   <w:style w:type="character" w:customStyle="1" w:styleId="FunctionTok">
     <w:name w:val="FunctionTok"/>
     <w:basedOn w:val="VerbatimChar"/>
     <w:rPr>
-      <w:color w:val="06287e"/>
+      <w:rFonts w:ascii="Consolas" w:hAnsi="Consolas"/>
+      <w:color w:val="06287E"/>
+      <w:sz w:val="22"/>
     </w:rPr>
   </w:style>
   <w:style w:type="character" w:customStyle="1" w:styleId="VariableTok">
     <w:name w:val="VariableTok"/>
     <w:basedOn w:val="VerbatimChar"/>
     <w:rPr>
-      <w:color w:val="19177c"/>
+      <w:rFonts w:ascii="Consolas" w:hAnsi="Consolas"/>
+      <w:color w:val="19177C"/>
+      <w:sz w:val="22"/>
     </w:rPr>
   </w:style>
   <w:style w:type="character" w:customStyle="1" w:styleId="ControlFlowTok">
     <w:name w:val="ControlFlowTok"/>
     <w:basedOn w:val="VerbatimChar"/>
     <w:rPr>
+      <w:rFonts w:ascii="Consolas" w:hAnsi="Consolas"/>
       <w:b/>
       <w:color w:val="007020"/>
+      <w:sz w:val="22"/>
     </w:rPr>
   </w:style>
   <w:style w:type="character" w:customStyle="1" w:styleId="OperatorTok">
     <w:name w:val="OperatorTok"/>
     <w:basedOn w:val="VerbatimChar"/>
     <w:rPr>
+      <w:rFonts w:ascii="Consolas" w:hAnsi="Consolas"/>
       <w:color w:val="666666"/>
+      <w:sz w:val="22"/>
     </w:rPr>
   </w:style>
   <w:style w:type="character" w:customStyle="1" w:styleId="BuiltInTok">
     <w:name w:val="BuiltInTok"/>
     <w:basedOn w:val="VerbatimChar"/>
     <w:rPr>
+      <w:rFonts w:ascii="Consolas" w:hAnsi="Consolas"/>
       <w:color w:val="008000"/>
+      <w:sz w:val="22"/>
     </w:rPr>
   </w:style>
   <w:style w:type="character" w:customStyle="1" w:styleId="ExtensionTok">
     <w:name w:val="ExtensionTok"/>
     <w:basedOn w:val="VerbatimChar"/>
-    <w:rPr/>
+    <w:rPr>
+      <w:rFonts w:ascii="Consolas" w:hAnsi="Consolas"/>
+      <w:sz w:val="22"/>
+    </w:rPr>
   </w:style>
   <w:style w:type="character" w:customStyle="1" w:styleId="PreprocessorTok">
     <w:name w:val="PreprocessorTok"/>
     <w:basedOn w:val="VerbatimChar"/>
     <w:rPr>
-      <w:color w:val="bc7a00"/>
+      <w:rFonts w:ascii="Consolas" w:hAnsi="Consolas"/>
+      <w:color w:val="BC7A00"/>
+      <w:sz w:val="22"/>
     </w:rPr>
   </w:style>
   <w:style w:type="character" w:customStyle="1" w:styleId="AttributeTok">
     <w:name w:val="AttributeTok"/>
     <w:basedOn w:val="VerbatimChar"/>
     <w:rPr>
-      <w:color w:val="7d9029"/>
+      <w:rFonts w:ascii="Consolas" w:hAnsi="Consolas"/>
+      <w:color w:val="7D9029"/>
+      <w:sz w:val="22"/>
     </w:rPr>
   </w:style>
   <w:style w:type="character" w:customStyle="1" w:styleId="RegionMarkerTok">
     <w:name w:val="RegionMarkerTok"/>
     <w:basedOn w:val="VerbatimChar"/>
-    <w:rPr/>
+    <w:rPr>
+      <w:rFonts w:ascii="Consolas" w:hAnsi="Consolas"/>
+      <w:sz w:val="22"/>
+    </w:rPr>
   </w:style>
   <w:style w:type="character" w:customStyle="1" w:styleId="InformationTok">
     <w:name w:val="InformationTok"/>
     <w:basedOn w:val="VerbatimChar"/>
     <w:rPr>
+      <w:rFonts w:ascii="Consolas" w:hAnsi="Consolas"/>
       <w:b/>
       <w:i/>
-      <w:color w:val="60a0b0"/>
+      <w:color w:val="60A0B0"/>
+      <w:sz w:val="22"/>
     </w:rPr>
   </w:style>
   <w:style w:type="character" w:customStyle="1" w:styleId="WarningTok">
     <w:name w:val="WarningTok"/>
     <w:basedOn w:val="VerbatimChar"/>
     <w:rPr>
+      <w:rFonts w:ascii="Consolas" w:hAnsi="Consolas"/>
       <w:b/>
       <w:i/>
-      <w:color w:val="60a0b0"/>
+      <w:color w:val="60A0B0"/>
+      <w:sz w:val="22"/>
     </w:rPr>
   </w:style>
   <w:style w:type="character" w:customStyle="1" w:styleId="AlertTok">
     <w:name w:val="AlertTok"/>
     <w:basedOn w:val="VerbatimChar"/>
     <w:rPr>
+      <w:rFonts w:ascii="Consolas" w:hAnsi="Consolas"/>
       <w:b/>
-      <w:color w:val="ff0000"/>
+      <w:color w:val="FF0000"/>
+      <w:sz w:val="22"/>
     </w:rPr>
   </w:style>
   <w:style w:type="character" w:customStyle="1" w:styleId="ErrorTok">
     <w:name w:val="ErrorTok"/>
     <w:basedOn w:val="VerbatimChar"/>
     <w:rPr>
+      <w:rFonts w:ascii="Consolas" w:hAnsi="Consolas"/>
       <w:b/>
-      <w:color w:val="ff0000"/>
+      <w:color w:val="FF0000"/>
+      <w:sz w:val="22"/>
     </w:rPr>
   </w:style>
   <w:style w:type="character" w:customStyle="1" w:styleId="NormalTok">
     <w:name w:val="NormalTok"/>
     <w:basedOn w:val="VerbatimChar"/>
-    <w:rPr/>
+    <w:rPr>
+      <w:rFonts w:ascii="Consolas" w:hAnsi="Consolas"/>
+      <w:sz w:val="22"/>
+    </w:rPr>
   </w:style>
 </w:styles>
 </file>

</xml_diff>